<commit_message>
fix: them logo return
</commit_message>
<xml_diff>
--- a/MOP/MOP OSD.docx
+++ b/MOP/MOP OSD.docx
@@ -1,6 +1,6 @@
 
 <file path=word/document.xml><?xml version="1.0" encoding="utf-8"?>
-<w:document xmlns:wpc="http://schemas.microsoft.com/office/word/2010/wordprocessingCanvas" xmlns:mc="http://schemas.openxmlformats.org/markup-compatibility/2006" xmlns:o="urn:schemas-microsoft-com:office:office" xmlns:r="http://schemas.openxmlformats.org/officeDocument/2006/relationships" xmlns:m="http://schemas.openxmlformats.org/officeDocument/2006/math" xmlns:v="urn:schemas-microsoft-com:vml" xmlns:wp14="http://schemas.microsoft.com/office/word/2010/wordprocessingDrawing" xmlns:wp="http://schemas.openxmlformats.org/drawingml/2006/wordprocessingDrawing" xmlns:w10="urn:schemas-microsoft-com:office:word" xmlns:w="http://schemas.openxmlformats.org/wordprocessingml/2006/main" xmlns:w14="http://schemas.microsoft.com/office/word/2010/wordml" xmlns:w15="http://schemas.microsoft.com/office/word/2012/wordml" xmlns:w16se="http://schemas.microsoft.com/office/word/2015/wordml/symex" xmlns:w16cid="http://schemas.microsoft.com/office/word/2016/wordml/cid" xmlns:w16="http://schemas.microsoft.com/office/word/2018/wordml" xmlns:w16cex="http://schemas.microsoft.com/office/word/2018/wordml/cex" xmlns:w16sdtdh="http://schemas.microsoft.com/office/word/2020/wordml/sdtdatahash" xmlns:wne="http://schemas.microsoft.com/office/word/2006/wordml" xmlns:wpg="http://schemas.microsoft.com/office/word/2010/wordprocessingGroup" xmlns:wps="http://schemas.microsoft.com/office/word/2010/wordprocessingShape" mc:Ignorable="w14 w15 w16se w16cid w16 w16cex w16sdtdh wp14">
+<w:document xmlns:wpc="http://schemas.microsoft.com/office/word/2010/wordprocessingCanvas" xmlns:cx="http://schemas.microsoft.com/office/drawing/2014/chartex" xmlns:cx1="http://schemas.microsoft.com/office/drawing/2015/9/8/chartex" xmlns:cx2="http://schemas.microsoft.com/office/drawing/2015/10/21/chartex" xmlns:cx3="http://schemas.microsoft.com/office/drawing/2016/5/9/chartex" xmlns:cx4="http://schemas.microsoft.com/office/drawing/2016/5/10/chartex" xmlns:cx5="http://schemas.microsoft.com/office/drawing/2016/5/11/chartex" xmlns:cx6="http://schemas.microsoft.com/office/drawing/2016/5/12/chartex" xmlns:cx7="http://schemas.microsoft.com/office/drawing/2016/5/13/chartex" xmlns:cx8="http://schemas.microsoft.com/office/drawing/2016/5/14/chartex" xmlns:mc="http://schemas.openxmlformats.org/markup-compatibility/2006" xmlns:aink="http://schemas.microsoft.com/office/drawing/2016/ink" xmlns:am3d="http://schemas.microsoft.com/office/drawing/2017/model3d" xmlns:o="urn:schemas-microsoft-com:office:office" xmlns:oel="http://schemas.microsoft.com/office/2019/extlst" xmlns:r="http://schemas.openxmlformats.org/officeDocument/2006/relationships" xmlns:m="http://schemas.openxmlformats.org/officeDocument/2006/math" xmlns:v="urn:schemas-microsoft-com:vml" xmlns:wp14="http://schemas.microsoft.com/office/word/2010/wordprocessingDrawing" xmlns:wp="http://schemas.openxmlformats.org/drawingml/2006/wordprocessingDrawing" xmlns:w10="urn:schemas-microsoft-com:office:word" xmlns:w="http://schemas.openxmlformats.org/wordprocessingml/2006/main" xmlns:w14="http://schemas.microsoft.com/office/word/2010/wordml" xmlns:w15="http://schemas.microsoft.com/office/word/2012/wordml" xmlns:w16cex="http://schemas.microsoft.com/office/word/2018/wordml/cex" xmlns:w16cid="http://schemas.microsoft.com/office/word/2016/wordml/cid" xmlns:w16="http://schemas.microsoft.com/office/word/2018/wordml" xmlns:w16du="http://schemas.microsoft.com/office/word/2023/wordml/word16du" xmlns:w16sdtdh="http://schemas.microsoft.com/office/word/2020/wordml/sdtdatahash" xmlns:w16sdtfl="http://schemas.microsoft.com/office/word/2024/wordml/sdtformatlock" xmlns:w16se="http://schemas.microsoft.com/office/word/2015/wordml/symex" xmlns:wpg="http://schemas.microsoft.com/office/word/2010/wordprocessingGroup" xmlns:wpi="http://schemas.microsoft.com/office/word/2010/wordprocessingInk" xmlns:wne="http://schemas.microsoft.com/office/word/2006/wordml" xmlns:wps="http://schemas.microsoft.com/office/word/2010/wordprocessingShape" mc:Ignorable="w14 w15 w16se w16cid w16 w16cex w16sdtdh w16sdtfl w16du wp14">
   <w:body>
     <w:p>
       <w:pPr>
@@ -9,11 +9,7 @@
       </w:pPr>
       <w:r>
         <w:rPr>
-          <w:rFonts w:ascii="Aptos Display" w:hAnsi="Aptos Display" w:cs="Aptos Display" w:asciiTheme="majorHAnsi" w:hAnsiTheme="majorHAnsi" w:eastAsiaTheme="majorEastAsia" w:csTheme="majorBidi"/>
-          <w:color w:val="0F4761" w:themeColor="accent1" w:themeShade="BF"/>
-          <w:kern w:val="2"/>
-          <w:sz w:val="40"/>
-          <w:szCs w:val="40"/>
+          <w:rFonts w:cs="Aptos Display"/>
         </w:rPr>
         <w:t>MOP PA1 OSD</w:t>
       </w:r>
@@ -25,15 +21,10 @@
           <w:ilvl w:val="0"/>
           <w:numId w:val="1"/>
         </w:numPr>
-        <w:ind w:left="720" w:hanging="360"/>
-      </w:pPr>
-      <w:r>
-        <w:rPr>
-          <w:rFonts w:ascii="Aptos Display" w:hAnsi="Aptos Display" w:cs="Aptos Display" w:asciiTheme="majorHAnsi" w:hAnsiTheme="majorHAnsi" w:eastAsiaTheme="majorEastAsia" w:csTheme="majorBidi"/>
-          <w:color w:val="0F4761" w:themeColor="accent1" w:themeShade="BF"/>
-          <w:kern w:val="2"/>
-          <w:sz w:val="32"/>
-          <w:szCs w:val="32"/>
+      </w:pPr>
+      <w:r>
+        <w:rPr>
+          <w:rFonts w:cs="Aptos Display"/>
         </w:rPr>
         <w:t>As-Is</w:t>
       </w:r>
@@ -45,14 +36,10 @@
           <w:ilvl w:val="0"/>
           <w:numId w:val="3"/>
         </w:numPr>
-        <w:ind w:left="720" w:hanging="360"/>
-      </w:pPr>
-      <w:r>
-        <w:rPr>
-          <w:rFonts w:ascii="Aptos" w:hAnsi="Aptos" w:eastAsia="Aptos" w:cs="Aptos" w:asciiTheme="minorHAnsi" w:hAnsiTheme="minorHAnsi" w:eastAsiaTheme="minorHAnsi" w:csTheme="minorBidi"/>
-          <w:kern w:val="2"/>
-          <w:sz w:val="24"/>
-          <w:szCs w:val="24"/>
+      </w:pPr>
+      <w:r>
+        <w:rPr>
+          <w:rFonts w:cs="Aptos"/>
         </w:rPr>
         <w:t>Tạo thư mục</w:t>
       </w:r>
@@ -66,10 +53,7 @@
       </w:pPr>
       <w:r>
         <w:rPr>
-          <w:rFonts w:ascii="Courier New" w:hAnsi="Courier New" w:eastAsia="Aptos" w:cs="Courier New" w:eastAsiaTheme="minorHAnsi"/>
-          <w:kern w:val="2"/>
-          <w:sz w:val="24"/>
-          <w:szCs w:val="24"/>
+          <w:rFonts w:ascii="Courier New" w:hAnsi="Courier New" w:cs="Courier New"/>
         </w:rPr>
         <w:t>export X=1</w:t>
       </w:r>
@@ -83,10 +67,7 @@
       </w:pPr>
       <w:r>
         <w:rPr>
-          <w:rFonts w:ascii="Courier New" w:hAnsi="Courier New" w:eastAsia="Aptos" w:cs="Courier New" w:eastAsiaTheme="minorHAnsi"/>
-          <w:kern w:val="2"/>
-          <w:sz w:val="24"/>
-          <w:szCs w:val="24"/>
+          <w:rFonts w:ascii="Courier New" w:hAnsi="Courier New" w:cs="Courier New"/>
         </w:rPr>
         <w:t>export EVIDENCE="$HOME/pa1-prelab-$(date +%Y%m%d-%H%M%S)"</w:t>
       </w:r>
@@ -108,10 +89,7 @@
       </w:pPr>
       <w:r>
         <w:rPr>
-          <w:rFonts w:ascii="Courier New" w:hAnsi="Courier New" w:eastAsia="Aptos" w:cs="Courier New" w:eastAsiaTheme="minorHAnsi"/>
-          <w:kern w:val="2"/>
-          <w:sz w:val="24"/>
-          <w:szCs w:val="24"/>
+          <w:rFonts w:ascii="Courier New" w:hAnsi="Courier New" w:cs="Courier New"/>
         </w:rPr>
         <w:t>mkdir -p "$EVIDENCE"</w:t>
       </w:r>
@@ -133,10 +111,7 @@
       </w:pPr>
       <w:r>
         <w:rPr>
-          <w:rFonts w:ascii="Courier New" w:hAnsi="Courier New" w:eastAsia="Aptos" w:cs="Courier New" w:eastAsiaTheme="minorHAnsi"/>
-          <w:kern w:val="2"/>
-          <w:sz w:val="24"/>
-          <w:szCs w:val="24"/>
+          <w:rFonts w:ascii="Courier New" w:hAnsi="Courier New" w:cs="Courier New"/>
         </w:rPr>
         <w:t>echo "X=osd.$X"</w:t>
       </w:r>
@@ -150,10 +125,7 @@
       </w:pPr>
       <w:r>
         <w:rPr>
-          <w:rFonts w:ascii="Courier New" w:hAnsi="Courier New" w:eastAsia="Aptos" w:cs="Courier New" w:eastAsiaTheme="minorHAnsi"/>
-          <w:kern w:val="2"/>
-          <w:sz w:val="24"/>
-          <w:szCs w:val="24"/>
+          <w:rFonts w:ascii="Courier New" w:hAnsi="Courier New" w:cs="Courier New"/>
         </w:rPr>
         <w:t>echo "Evidence=$EVIDENCE"</w:t>
       </w:r>
@@ -174,17 +146,13 @@
           <w:numId w:val="3"/>
         </w:numPr>
         <w:spacing w:after="0"/>
-        <w:ind w:left="720" w:hanging="360"/>
-        <w:rPr>
-          <w:rFonts w:ascii="Courier New" w:hAnsi="Courier New" w:cs="Courier New"/>
-        </w:rPr>
-      </w:pPr>
-      <w:r>
-        <w:rPr>
-          <w:rFonts w:ascii="Courier New" w:hAnsi="Courier New" w:eastAsia="Aptos" w:cs="Courier New" w:eastAsiaTheme="minorHAnsi"/>
-          <w:kern w:val="2"/>
-          <w:sz w:val="24"/>
-          <w:szCs w:val="24"/>
+        <w:rPr>
+          <w:rFonts w:ascii="Courier New" w:hAnsi="Courier New" w:cs="Courier New"/>
+        </w:rPr>
+      </w:pPr>
+      <w:r>
+        <w:rPr>
+          <w:rFonts w:ascii="Courier New" w:hAnsi="Courier New" w:cs="Courier New"/>
         </w:rPr>
         <w:t>As is</w:t>
       </w:r>
@@ -206,10 +174,7 @@
       </w:pPr>
       <w:r>
         <w:rPr>
-          <w:rFonts w:ascii="Courier New" w:hAnsi="Courier New" w:eastAsia="Aptos" w:cs="Courier New" w:eastAsiaTheme="minorHAnsi"/>
-          <w:kern w:val="2"/>
-          <w:sz w:val="24"/>
-          <w:szCs w:val="24"/>
+          <w:rFonts w:ascii="Courier New" w:hAnsi="Courier New" w:cs="Courier New"/>
         </w:rPr>
         <w:t>ceph -s | tee "$EVIDENCE/01-ceph-s.txt"</w:t>
       </w:r>
@@ -231,10 +196,7 @@
       </w:pPr>
       <w:r>
         <w:rPr>
-          <w:rFonts w:ascii="Courier New" w:hAnsi="Courier New" w:eastAsia="Aptos" w:cs="Courier New" w:eastAsiaTheme="minorHAnsi"/>
-          <w:kern w:val="2"/>
-          <w:sz w:val="24"/>
-          <w:szCs w:val="24"/>
+          <w:rFonts w:ascii="Courier New" w:hAnsi="Courier New" w:cs="Courier New"/>
         </w:rPr>
         <w:t>ceph health detail \</w:t>
       </w:r>
@@ -248,10 +210,7 @@
       </w:pPr>
       <w:r>
         <w:rPr>
-          <w:rFonts w:ascii="Courier New" w:hAnsi="Courier New" w:eastAsia="Aptos" w:cs="Courier New" w:eastAsiaTheme="minorHAnsi"/>
-          <w:kern w:val="2"/>
-          <w:sz w:val="24"/>
-          <w:szCs w:val="24"/>
+          <w:rFonts w:ascii="Courier New" w:hAnsi="Courier New" w:cs="Courier New"/>
         </w:rPr>
         <w:t xml:space="preserve">  | tee "$EVIDENCE/02-health-detail.txt"</w:t>
       </w:r>
@@ -273,10 +232,7 @@
       </w:pPr>
       <w:r>
         <w:rPr>
-          <w:rFonts w:ascii="Courier New" w:hAnsi="Courier New" w:eastAsia="Aptos" w:cs="Courier New" w:eastAsiaTheme="minorHAnsi"/>
-          <w:kern w:val="2"/>
-          <w:sz w:val="24"/>
-          <w:szCs w:val="24"/>
+          <w:rFonts w:ascii="Courier New" w:hAnsi="Courier New" w:cs="Courier New"/>
         </w:rPr>
         <w:t>ceph versions \</w:t>
       </w:r>
@@ -290,10 +246,7 @@
       </w:pPr>
       <w:r>
         <w:rPr>
-          <w:rFonts w:ascii="Courier New" w:hAnsi="Courier New" w:eastAsia="Aptos" w:cs="Courier New" w:eastAsiaTheme="minorHAnsi"/>
-          <w:kern w:val="2"/>
-          <w:sz w:val="24"/>
-          <w:szCs w:val="24"/>
+          <w:rFonts w:ascii="Courier New" w:hAnsi="Courier New" w:cs="Courier New"/>
         </w:rPr>
         <w:t xml:space="preserve">  | tee "$EVIDENCE/03-versions.txt"</w:t>
       </w:r>
@@ -315,10 +268,7 @@
       </w:pPr>
       <w:r>
         <w:rPr>
-          <w:rFonts w:ascii="Courier New" w:hAnsi="Courier New" w:eastAsia="Aptos" w:cs="Courier New" w:eastAsiaTheme="minorHAnsi"/>
-          <w:kern w:val="2"/>
-          <w:sz w:val="24"/>
-          <w:szCs w:val="24"/>
+          <w:rFonts w:ascii="Courier New" w:hAnsi="Courier New" w:cs="Courier New"/>
         </w:rPr>
         <w:t>ceph quorum_status -f json-pretty \</w:t>
       </w:r>
@@ -332,10 +282,7 @@
       </w:pPr>
       <w:r>
         <w:rPr>
-          <w:rFonts w:ascii="Courier New" w:hAnsi="Courier New" w:eastAsia="Aptos" w:cs="Courier New" w:eastAsiaTheme="minorHAnsi"/>
-          <w:kern w:val="2"/>
-          <w:sz w:val="24"/>
-          <w:szCs w:val="24"/>
+          <w:rFonts w:ascii="Courier New" w:hAnsi="Courier New" w:cs="Courier New"/>
         </w:rPr>
         <w:t xml:space="preserve">  &gt; "$EVIDENCE/04-quorum-status.json"</w:t>
       </w:r>
@@ -357,10 +304,7 @@
       </w:pPr>
       <w:r>
         <w:rPr>
-          <w:rFonts w:ascii="Courier New" w:hAnsi="Courier New" w:eastAsia="Aptos" w:cs="Courier New" w:eastAsiaTheme="minorHAnsi"/>
-          <w:kern w:val="2"/>
-          <w:sz w:val="24"/>
-          <w:szCs w:val="24"/>
+          <w:rFonts w:ascii="Courier New" w:hAnsi="Courier New" w:cs="Courier New"/>
         </w:rPr>
         <w:t>ceph osd tree \</w:t>
       </w:r>
@@ -374,10 +318,7 @@
       </w:pPr>
       <w:r>
         <w:rPr>
-          <w:rFonts w:ascii="Courier New" w:hAnsi="Courier New" w:eastAsia="Aptos" w:cs="Courier New" w:eastAsiaTheme="minorHAnsi"/>
-          <w:kern w:val="2"/>
-          <w:sz w:val="24"/>
-          <w:szCs w:val="24"/>
+          <w:rFonts w:ascii="Courier New" w:hAnsi="Courier New" w:cs="Courier New"/>
         </w:rPr>
         <w:t xml:space="preserve">  | tee "$EVIDENCE/05-osd-tree.txt"</w:t>
       </w:r>
@@ -399,10 +340,7 @@
       </w:pPr>
       <w:r>
         <w:rPr>
-          <w:rFonts w:ascii="Courier New" w:hAnsi="Courier New" w:eastAsia="Aptos" w:cs="Courier New" w:eastAsiaTheme="minorHAnsi"/>
-          <w:kern w:val="2"/>
-          <w:sz w:val="24"/>
-          <w:szCs w:val="24"/>
+          <w:rFonts w:ascii="Courier New" w:hAnsi="Courier New" w:cs="Courier New"/>
         </w:rPr>
         <w:t>ceph osd df tree \</w:t>
       </w:r>
@@ -416,10 +354,7 @@
       </w:pPr>
       <w:r>
         <w:rPr>
-          <w:rFonts w:ascii="Courier New" w:hAnsi="Courier New" w:eastAsia="Aptos" w:cs="Courier New" w:eastAsiaTheme="minorHAnsi"/>
-          <w:kern w:val="2"/>
-          <w:sz w:val="24"/>
-          <w:szCs w:val="24"/>
+          <w:rFonts w:ascii="Courier New" w:hAnsi="Courier New" w:cs="Courier New"/>
         </w:rPr>
         <w:t xml:space="preserve">  | tee "$EVIDENCE/06-osd-df-tree.txt"</w:t>
       </w:r>
@@ -441,10 +376,7 @@
       </w:pPr>
       <w:r>
         <w:rPr>
-          <w:rFonts w:ascii="Courier New" w:hAnsi="Courier New" w:eastAsia="Aptos" w:cs="Courier New" w:eastAsiaTheme="minorHAnsi"/>
-          <w:kern w:val="2"/>
-          <w:sz w:val="24"/>
-          <w:szCs w:val="24"/>
+          <w:rFonts w:ascii="Courier New" w:hAnsi="Courier New" w:cs="Courier New"/>
         </w:rPr>
         <w:t>ceph osd dump -f json-pretty \</w:t>
       </w:r>
@@ -458,10 +390,7 @@
       </w:pPr>
       <w:r>
         <w:rPr>
-          <w:rFonts w:ascii="Courier New" w:hAnsi="Courier New" w:eastAsia="Aptos" w:cs="Courier New" w:eastAsiaTheme="minorHAnsi"/>
-          <w:kern w:val="2"/>
-          <w:sz w:val="24"/>
-          <w:szCs w:val="24"/>
+          <w:rFonts w:ascii="Courier New" w:hAnsi="Courier New" w:cs="Courier New"/>
         </w:rPr>
         <w:t xml:space="preserve">  &gt; "$EVIDENCE/07-osd-dump.json"</w:t>
       </w:r>
@@ -483,10 +412,7 @@
       </w:pPr>
       <w:r>
         <w:rPr>
-          <w:rFonts w:ascii="Courier New" w:hAnsi="Courier New" w:eastAsia="Aptos" w:cs="Courier New" w:eastAsiaTheme="minorHAnsi"/>
-          <w:kern w:val="2"/>
-          <w:sz w:val="24"/>
-          <w:szCs w:val="24"/>
+          <w:rFonts w:ascii="Courier New" w:hAnsi="Courier New" w:cs="Courier New"/>
         </w:rPr>
         <w:t>ceph osd getcrushmap \</w:t>
       </w:r>
@@ -500,53 +426,29 @@
       </w:pPr>
       <w:r>
         <w:rPr>
-          <w:rFonts w:ascii="Courier New" w:hAnsi="Courier New" w:eastAsia="Aptos" w:cs="Courier New" w:eastAsiaTheme="minorHAnsi"/>
-          <w:kern w:val="2"/>
-          <w:sz w:val="24"/>
-          <w:szCs w:val="24"/>
-        </w:rPr>
-        <w:t xml:space="preserve">  </w:t>
-      </w:r>
-      <w:r>
-        <w:rPr>
-          <w:rFonts w:ascii="Courier New" w:hAnsi="Courier New" w:eastAsia="Aptos" w:cs="Courier New" w:eastAsiaTheme="minorHAnsi"/>
-          <w:kern w:val="2"/>
-          <w:sz w:val="24"/>
-          <w:szCs w:val="24"/>
-        </w:rPr>
-        <w:t>&gt;</w:t>
-      </w:r>
-      <w:r>
-        <w:rPr>
-          <w:rFonts w:ascii="Courier New" w:hAnsi="Courier New" w:eastAsia="Aptos" w:cs="Courier New" w:eastAsiaTheme="minorHAnsi"/>
-          <w:kern w:val="2"/>
-          <w:sz w:val="24"/>
-          <w:szCs w:val="24"/>
-        </w:rPr>
-        <w:t xml:space="preserve"> "$EVIDENCE/08-crushmap.bin"</w:t>
-      </w:r>
-    </w:p>
-    <w:p>
-      <w:pPr>
-        <w:spacing w:after="0"/>
-        <w:rPr>
-          <w:rFonts w:ascii="Courier New" w:hAnsi="Courier New" w:cs="Courier New"/>
-        </w:rPr>
-      </w:pPr>
-    </w:p>
-    <w:p>
-      <w:pPr>
-        <w:spacing w:after="0"/>
-        <w:rPr>
-          <w:rFonts w:ascii="Courier New" w:hAnsi="Courier New" w:cs="Courier New"/>
-        </w:rPr>
-      </w:pPr>
-      <w:r>
-        <w:rPr>
-          <w:rFonts w:ascii="Courier New" w:hAnsi="Courier New" w:eastAsia="Aptos" w:cs="Courier New" w:eastAsiaTheme="minorHAnsi"/>
-          <w:kern w:val="2"/>
-          <w:sz w:val="24"/>
-          <w:szCs w:val="24"/>
+          <w:rFonts w:ascii="Courier New" w:hAnsi="Courier New" w:cs="Courier New"/>
+        </w:rPr>
+        <w:t xml:space="preserve">  &gt; "$EVIDENCE/08-crushmap.bin"</w:t>
+      </w:r>
+    </w:p>
+    <w:p>
+      <w:pPr>
+        <w:spacing w:after="0"/>
+        <w:rPr>
+          <w:rFonts w:ascii="Courier New" w:hAnsi="Courier New" w:cs="Courier New"/>
+        </w:rPr>
+      </w:pPr>
+    </w:p>
+    <w:p>
+      <w:pPr>
+        <w:spacing w:after="0"/>
+        <w:rPr>
+          <w:rFonts w:ascii="Courier New" w:hAnsi="Courier New" w:cs="Courier New"/>
+        </w:rPr>
+      </w:pPr>
+      <w:r>
+        <w:rPr>
+          <w:rFonts w:ascii="Courier New" w:hAnsi="Courier New" w:cs="Courier New"/>
         </w:rPr>
         <w:t>ceph config dump \</w:t>
       </w:r>
@@ -559,13 +461,10 @@
         </w:rPr>
       </w:pPr>
       <w:r>
+        <w:rPr>
+          <w:rFonts w:ascii="Courier New" w:hAnsi="Courier New" w:cs="Courier New"/>
+        </w:rPr>
         <w:lastRenderedPageBreak/>
-        <w:rPr>
-          <w:rFonts w:ascii="Courier New" w:hAnsi="Courier New" w:eastAsia="Aptos" w:cs="Courier New" w:eastAsiaTheme="minorHAnsi"/>
-          <w:kern w:val="2"/>
-          <w:sz w:val="24"/>
-          <w:szCs w:val="24"/>
-        </w:rPr>
         <w:t xml:space="preserve">  &gt; "$EVIDENCE/09-config-dump.txt"</w:t>
       </w:r>
     </w:p>
@@ -578,10 +477,7 @@
       </w:pPr>
       <w:r>
         <w:rPr>
-          <w:rFonts w:ascii="Courier New" w:hAnsi="Courier New" w:eastAsia="Aptos" w:cs="Courier New" w:eastAsiaTheme="minorHAnsi"/>
-          <w:kern w:val="2"/>
-          <w:sz w:val="24"/>
-          <w:szCs w:val="24"/>
+          <w:rFonts w:ascii="Courier New" w:hAnsi="Courier New" w:cs="Courier New"/>
         </w:rPr>
         <w:t>ceph pg ls-by-osd osd.$X \</w:t>
       </w:r>
@@ -595,10 +491,7 @@
       </w:pPr>
       <w:r>
         <w:rPr>
-          <w:rFonts w:ascii="Courier New" w:hAnsi="Courier New" w:eastAsia="Aptos" w:cs="Courier New" w:eastAsiaTheme="minorHAnsi"/>
-          <w:kern w:val="2"/>
-          <w:sz w:val="24"/>
-          <w:szCs w:val="24"/>
+          <w:rFonts w:ascii="Courier New" w:hAnsi="Courier New" w:cs="Courier New"/>
         </w:rPr>
         <w:t xml:space="preserve">  | tee "$EVIDENCE/10-X-pgs.txt"</w:t>
       </w:r>
@@ -620,10 +513,7 @@
       </w:pPr>
       <w:r>
         <w:rPr>
-          <w:rFonts w:ascii="Courier New" w:hAnsi="Courier New" w:eastAsia="Aptos" w:cs="Courier New" w:eastAsiaTheme="minorHAnsi"/>
-          <w:kern w:val="2"/>
-          <w:sz w:val="24"/>
-          <w:szCs w:val="24"/>
+          <w:rFonts w:ascii="Courier New" w:hAnsi="Courier New" w:cs="Courier New"/>
         </w:rPr>
         <w:t>ceph pg ls-by-primary osd.$X \</w:t>
       </w:r>
@@ -637,10 +527,7 @@
       </w:pPr>
       <w:r>
         <w:rPr>
-          <w:rFonts w:ascii="Courier New" w:hAnsi="Courier New" w:eastAsia="Aptos" w:cs="Courier New" w:eastAsiaTheme="minorHAnsi"/>
-          <w:kern w:val="2"/>
-          <w:sz w:val="24"/>
-          <w:szCs w:val="24"/>
+          <w:rFonts w:ascii="Courier New" w:hAnsi="Courier New" w:cs="Courier New"/>
         </w:rPr>
         <w:t xml:space="preserve">  | tee "$EVIDENCE/11-X-primary-pgs.txt"</w:t>
       </w:r>
@@ -654,10 +541,7 @@
       </w:pPr>
       <w:r>
         <w:rPr>
-          <w:rFonts w:ascii="Courier New" w:hAnsi="Courier New" w:eastAsia="Aptos" w:cs="Courier New" w:eastAsiaTheme="minorHAnsi"/>
-          <w:kern w:val="2"/>
-          <w:sz w:val="24"/>
-          <w:szCs w:val="24"/>
+          <w:rFonts w:ascii="Courier New" w:hAnsi="Courier New" w:cs="Courier New"/>
         </w:rPr>
         <w:t>ceph pg ls-by-osd osd.$X -f json-pretty \</w:t>
       </w:r>
@@ -671,10 +555,7 @@
       </w:pPr>
       <w:r>
         <w:rPr>
-          <w:rFonts w:ascii="Courier New" w:hAnsi="Courier New" w:eastAsia="Aptos" w:cs="Courier New" w:eastAsiaTheme="minorHAnsi"/>
-          <w:kern w:val="2"/>
-          <w:sz w:val="24"/>
-          <w:szCs w:val="24"/>
+          <w:rFonts w:ascii="Courier New" w:hAnsi="Courier New" w:cs="Courier New"/>
         </w:rPr>
         <w:t xml:space="preserve">  &gt; "$EVIDENCE/12-X-pgs.json"</w:t>
       </w:r>
@@ -696,10 +577,7 @@
       </w:pPr>
       <w:r>
         <w:rPr>
-          <w:rFonts w:ascii="Courier New" w:hAnsi="Courier New" w:eastAsia="Aptos" w:cs="Courier New" w:eastAsiaTheme="minorHAnsi"/>
-          <w:kern w:val="2"/>
-          <w:sz w:val="24"/>
-          <w:szCs w:val="24"/>
+          <w:rFonts w:ascii="Courier New" w:hAnsi="Courier New" w:cs="Courier New"/>
         </w:rPr>
         <w:t>ceph pg ls-by-primary osd.$X -f json-pretty \</w:t>
       </w:r>
@@ -713,10 +591,7 @@
       </w:pPr>
       <w:r>
         <w:rPr>
-          <w:rFonts w:ascii="Courier New" w:hAnsi="Courier New" w:eastAsia="Aptos" w:cs="Courier New" w:eastAsiaTheme="minorHAnsi"/>
-          <w:kern w:val="2"/>
-          <w:sz w:val="24"/>
-          <w:szCs w:val="24"/>
+          <w:rFonts w:ascii="Courier New" w:hAnsi="Courier New" w:cs="Courier New"/>
         </w:rPr>
         <w:t xml:space="preserve">  &gt; "$EVIDENCE/13-X-primary-pgs.json"</w:t>
       </w:r>
@@ -730,10 +605,7 @@
       </w:pPr>
       <w:r>
         <w:rPr>
-          <w:rFonts w:ascii="Courier New" w:hAnsi="Courier New" w:eastAsia="Aptos" w:cs="Courier New" w:eastAsiaTheme="minorHAnsi"/>
-          <w:kern w:val="2"/>
-          <w:sz w:val="24"/>
-          <w:szCs w:val="24"/>
+          <w:rFonts w:ascii="Courier New" w:hAnsi="Courier New" w:cs="Courier New"/>
         </w:rPr>
         <w:t>ceph pg ls-by-osd osd.$X -f json \</w:t>
       </w:r>
@@ -747,10 +619,7 @@
       </w:pPr>
       <w:r>
         <w:rPr>
-          <w:rFonts w:ascii="Courier New" w:hAnsi="Courier New" w:eastAsia="Aptos" w:cs="Courier New" w:eastAsiaTheme="minorHAnsi"/>
-          <w:kern w:val="2"/>
-          <w:sz w:val="24"/>
-          <w:szCs w:val="24"/>
+          <w:rFonts w:ascii="Courier New" w:hAnsi="Courier New" w:cs="Courier New"/>
         </w:rPr>
         <w:t xml:space="preserve">  | jq -r '.pg_stats[].pgid' \</w:t>
       </w:r>
@@ -764,10 +633,7 @@
       </w:pPr>
       <w:r>
         <w:rPr>
-          <w:rFonts w:ascii="Courier New" w:hAnsi="Courier New" w:eastAsia="Aptos" w:cs="Courier New" w:eastAsiaTheme="minorHAnsi"/>
-          <w:kern w:val="2"/>
-          <w:sz w:val="24"/>
-          <w:szCs w:val="24"/>
+          <w:rFonts w:ascii="Courier New" w:hAnsi="Courier New" w:cs="Courier New"/>
         </w:rPr>
         <w:t xml:space="preserve">  | while read PG; do</w:t>
       </w:r>
@@ -781,10 +647,7 @@
       </w:pPr>
       <w:r>
         <w:rPr>
-          <w:rFonts w:ascii="Courier New" w:hAnsi="Courier New" w:eastAsia="Aptos" w:cs="Courier New" w:eastAsiaTheme="minorHAnsi"/>
-          <w:kern w:val="2"/>
-          <w:sz w:val="24"/>
-          <w:szCs w:val="24"/>
+          <w:rFonts w:ascii="Courier New" w:hAnsi="Courier New" w:cs="Courier New"/>
         </w:rPr>
         <w:t xml:space="preserve">      ceph pg map "$PG"</w:t>
       </w:r>
@@ -798,10 +661,7 @@
       </w:pPr>
       <w:r>
         <w:rPr>
-          <w:rFonts w:ascii="Courier New" w:hAnsi="Courier New" w:eastAsia="Aptos" w:cs="Courier New" w:eastAsiaTheme="minorHAnsi"/>
-          <w:kern w:val="2"/>
-          <w:sz w:val="24"/>
-          <w:szCs w:val="24"/>
+          <w:rFonts w:ascii="Courier New" w:hAnsi="Courier New" w:cs="Courier New"/>
         </w:rPr>
         <w:t xml:space="preserve">    done \</w:t>
       </w:r>
@@ -815,10 +675,7 @@
       </w:pPr>
       <w:r>
         <w:rPr>
-          <w:rFonts w:ascii="Courier New" w:hAnsi="Courier New" w:eastAsia="Aptos" w:cs="Courier New" w:eastAsiaTheme="minorHAnsi"/>
-          <w:kern w:val="2"/>
-          <w:sz w:val="24"/>
-          <w:szCs w:val="24"/>
+          <w:rFonts w:ascii="Courier New" w:hAnsi="Courier New" w:cs="Courier New"/>
         </w:rPr>
         <w:t xml:space="preserve">  | tee "$EVIDENCE/14-X-pg-mapping.txt"</w:t>
       </w:r>
@@ -832,10 +689,7 @@
       </w:pPr>
       <w:r>
         <w:rPr>
-          <w:rFonts w:ascii="Courier New" w:hAnsi="Courier New" w:eastAsia="Aptos" w:cs="Courier New" w:eastAsiaTheme="minorHAnsi"/>
-          <w:kern w:val="2"/>
-          <w:sz w:val="24"/>
-          <w:szCs w:val="24"/>
+          <w:rFonts w:ascii="Courier New" w:hAnsi="Courier New" w:cs="Courier New"/>
         </w:rPr>
         <w:t>ceph osd tree \</w:t>
       </w:r>
@@ -849,10 +703,7 @@
       </w:pPr>
       <w:r>
         <w:rPr>
-          <w:rFonts w:ascii="Courier New" w:hAnsi="Courier New" w:eastAsia="Aptos" w:cs="Courier New" w:eastAsiaTheme="minorHAnsi"/>
-          <w:kern w:val="2"/>
-          <w:sz w:val="24"/>
-          <w:szCs w:val="24"/>
+          <w:rFonts w:ascii="Courier New" w:hAnsi="Courier New" w:cs="Courier New"/>
         </w:rPr>
         <w:t xml:space="preserve">  | tee "$EVIDENCE/15-tree-before-S.txt"</w:t>
       </w:r>
@@ -874,10 +725,7 @@
       </w:pPr>
       <w:r>
         <w:rPr>
-          <w:rFonts w:ascii="Courier New" w:hAnsi="Courier New" w:eastAsia="Aptos" w:cs="Courier New" w:eastAsiaTheme="minorHAnsi"/>
-          <w:kern w:val="2"/>
-          <w:sz w:val="24"/>
-          <w:szCs w:val="24"/>
+          <w:rFonts w:ascii="Courier New" w:hAnsi="Courier New" w:cs="Courier New"/>
         </w:rPr>
         <w:t>ceph osd dump \</w:t>
       </w:r>
@@ -891,10 +739,7 @@
       </w:pPr>
       <w:r>
         <w:rPr>
-          <w:rFonts w:ascii="Courier New" w:hAnsi="Courier New" w:eastAsia="Aptos" w:cs="Courier New" w:eastAsiaTheme="minorHAnsi"/>
-          <w:kern w:val="2"/>
-          <w:sz w:val="24"/>
-          <w:szCs w:val="24"/>
+          <w:rFonts w:ascii="Courier New" w:hAnsi="Courier New" w:cs="Courier New"/>
         </w:rPr>
         <w:t xml:space="preserve">  | tee "$EVIDENCE/16-osd-dump-before-S.txt"</w:t>
       </w:r>
@@ -916,10 +761,7 @@
       </w:pPr>
       <w:r>
         <w:rPr>
-          <w:rFonts w:ascii="Courier New" w:hAnsi="Courier New" w:eastAsia="Aptos" w:cs="Courier New" w:eastAsiaTheme="minorHAnsi"/>
-          <w:kern w:val="2"/>
-          <w:sz w:val="24"/>
-          <w:szCs w:val="24"/>
+          <w:rFonts w:ascii="Courier New" w:hAnsi="Courier New" w:cs="Courier New"/>
         </w:rPr>
         <w:t>ceph osd dump | grep '^flags' \</w:t>
       </w:r>
@@ -933,10 +775,7 @@
       </w:pPr>
       <w:r>
         <w:rPr>
-          <w:rFonts w:ascii="Courier New" w:hAnsi="Courier New" w:eastAsia="Aptos" w:cs="Courier New" w:eastAsiaTheme="minorHAnsi"/>
-          <w:kern w:val="2"/>
-          <w:sz w:val="24"/>
-          <w:szCs w:val="24"/>
+          <w:rFonts w:ascii="Courier New" w:hAnsi="Courier New" w:cs="Courier New"/>
         </w:rPr>
         <w:t xml:space="preserve">  | tee "$EVIDENCE/17-osd-flags.txt"</w:t>
       </w:r>
@@ -958,10 +797,7 @@
       </w:pPr>
       <w:r>
         <w:rPr>
-          <w:rFonts w:ascii="Courier New" w:hAnsi="Courier New" w:eastAsia="Aptos" w:cs="Courier New" w:eastAsiaTheme="minorHAnsi"/>
-          <w:kern w:val="2"/>
-          <w:sz w:val="24"/>
-          <w:szCs w:val="24"/>
+          <w:rFonts w:ascii="Courier New" w:hAnsi="Courier New" w:cs="Courier New"/>
         </w:rPr>
         <w:t>ceph osd dump | grep -E 'pg_upmap|pg_temp' \</w:t>
       </w:r>
@@ -975,10 +811,7 @@
       </w:pPr>
       <w:r>
         <w:rPr>
-          <w:rFonts w:ascii="Courier New" w:hAnsi="Courier New" w:eastAsia="Aptos" w:cs="Courier New" w:eastAsiaTheme="minorHAnsi"/>
-          <w:kern w:val="2"/>
-          <w:sz w:val="24"/>
-          <w:szCs w:val="24"/>
+          <w:rFonts w:ascii="Courier New" w:hAnsi="Courier New" w:cs="Courier New"/>
         </w:rPr>
         <w:t xml:space="preserve">  | tee "$EVIDENCE/18-existing-overrides.txt"</w:t>
       </w:r>
@@ -1000,10 +833,7 @@
       </w:pPr>
       <w:r>
         <w:rPr>
-          <w:rFonts w:ascii="Courier New" w:hAnsi="Courier New" w:eastAsia="Aptos" w:cs="Courier New" w:eastAsiaTheme="minorHAnsi"/>
-          <w:kern w:val="2"/>
-          <w:sz w:val="24"/>
-          <w:szCs w:val="24"/>
+          <w:rFonts w:ascii="Courier New" w:hAnsi="Courier New" w:cs="Courier New"/>
         </w:rPr>
         <w:t>ceph balancer status \</w:t>
       </w:r>
@@ -1017,10 +847,7 @@
       </w:pPr>
       <w:r>
         <w:rPr>
-          <w:rFonts w:ascii="Courier New" w:hAnsi="Courier New" w:eastAsia="Aptos" w:cs="Courier New" w:eastAsiaTheme="minorHAnsi"/>
-          <w:kern w:val="2"/>
-          <w:sz w:val="24"/>
-          <w:szCs w:val="24"/>
+          <w:rFonts w:ascii="Courier New" w:hAnsi="Courier New" w:cs="Courier New"/>
         </w:rPr>
         <w:t xml:space="preserve">  | tee "$EVIDENCE/19-balancer-status.txt"</w:t>
       </w:r>
@@ -1042,10 +869,7 @@
       </w:pPr>
       <w:r>
         <w:rPr>
-          <w:rFonts w:ascii="Courier New" w:hAnsi="Courier New" w:eastAsia="Aptos" w:cs="Courier New" w:eastAsiaTheme="minorHAnsi"/>
-          <w:kern w:val="2"/>
-          <w:sz w:val="24"/>
-          <w:szCs w:val="24"/>
+          <w:rFonts w:ascii="Courier New" w:hAnsi="Courier New" w:cs="Courier New"/>
         </w:rPr>
         <w:t>ceph osd pool autoscale-status \</w:t>
       </w:r>
@@ -1059,10 +883,7 @@
       </w:pPr>
       <w:r>
         <w:rPr>
-          <w:rFonts w:ascii="Courier New" w:hAnsi="Courier New" w:eastAsia="Aptos" w:cs="Courier New" w:eastAsiaTheme="minorHAnsi"/>
-          <w:kern w:val="2"/>
-          <w:sz w:val="24"/>
-          <w:szCs w:val="24"/>
+          <w:rFonts w:ascii="Courier New" w:hAnsi="Courier New" w:cs="Courier New"/>
         </w:rPr>
         <w:t xml:space="preserve">  | tee "$EVIDENCE/20-autoscale-status.txt"</w:t>
       </w:r>
@@ -1074,45 +895,27 @@
           <w:ilvl w:val="0"/>
           <w:numId w:val="1"/>
         </w:numPr>
-        <w:ind w:left="720" w:hanging="360"/>
         <w:rPr>
           <w:rFonts w:eastAsia="Times New Roman"/>
         </w:rPr>
       </w:pPr>
       <w:r>
         <w:rPr>
-          <w:rFonts w:ascii="Aptos Display" w:hAnsi="Aptos Display" w:eastAsia="Times New Roman" w:cs="Aptos Display" w:asciiTheme="majorHAnsi" w:hAnsiTheme="majorHAnsi" w:csTheme="majorBidi"/>
-          <w:color w:val="0F4761" w:themeColor="accent1" w:themeShade="BF"/>
-          <w:kern w:val="2"/>
-          <w:sz w:val="32"/>
-          <w:szCs w:val="32"/>
-        </w:rPr>
-        <w:t>Ok</w:t>
-      </w:r>
-      <w:r>
-        <w:rPr>
-          <w:rFonts w:ascii="Aptos Display" w:hAnsi="Aptos Display" w:eastAsia="Times New Roman" w:cs="Aptos Display" w:asciiTheme="majorHAnsi" w:hAnsiTheme="majorHAnsi" w:csTheme="majorBidi"/>
-          <w:color w:val="0F4761" w:themeColor="accent1" w:themeShade="BF"/>
-          <w:kern w:val="2"/>
-          <w:sz w:val="32"/>
-          <w:szCs w:val="32"/>
-        </w:rPr>
-        <w:t xml:space="preserve"> to stop </w:t>
-      </w:r>
-    </w:p>
-    <w:p>
-      <w:pPr>
-        <w:spacing w:after="0"/>
-        <w:rPr>
-          <w:rFonts w:ascii="Courier New" w:hAnsi="Courier New" w:cs="Courier New"/>
-        </w:rPr>
-      </w:pPr>
-      <w:r>
-        <w:rPr>
-          <w:rFonts w:ascii="Courier New" w:hAnsi="Courier New" w:eastAsia="Aptos" w:cs="Courier New" w:eastAsiaTheme="minorHAnsi"/>
-          <w:kern w:val="2"/>
-          <w:sz w:val="24"/>
-          <w:szCs w:val="24"/>
+          <w:rFonts w:eastAsia="Times New Roman" w:cs="Aptos Display"/>
+        </w:rPr>
+        <w:t xml:space="preserve">Ok to stop </w:t>
+      </w:r>
+    </w:p>
+    <w:p>
+      <w:pPr>
+        <w:spacing w:after="0"/>
+        <w:rPr>
+          <w:rFonts w:ascii="Courier New" w:hAnsi="Courier New" w:cs="Courier New"/>
+        </w:rPr>
+      </w:pPr>
+      <w:r>
+        <w:rPr>
+          <w:rFonts w:ascii="Courier New" w:hAnsi="Courier New" w:cs="Courier New"/>
         </w:rPr>
         <w:t>ceph -s</w:t>
       </w:r>
@@ -1126,10 +929,7 @@
       </w:pPr>
       <w:r>
         <w:rPr>
-          <w:rFonts w:ascii="Courier New" w:hAnsi="Courier New" w:eastAsia="Aptos" w:cs="Courier New" w:eastAsiaTheme="minorHAnsi"/>
-          <w:kern w:val="2"/>
-          <w:sz w:val="24"/>
-          <w:szCs w:val="24"/>
+          <w:rFonts w:ascii="Courier New" w:hAnsi="Courier New" w:cs="Courier New"/>
         </w:rPr>
         <w:t>ceph osd ok-to-stop 1</w:t>
       </w:r>
@@ -1143,10 +943,7 @@
       </w:pPr>
       <w:r>
         <w:rPr>
-          <w:rFonts w:ascii="Courier New" w:hAnsi="Courier New" w:eastAsia="Aptos" w:cs="Courier New" w:eastAsiaTheme="minorHAnsi"/>
-          <w:kern w:val="2"/>
-          <w:sz w:val="24"/>
-          <w:szCs w:val="24"/>
+          <w:rFonts w:ascii="Courier New" w:hAnsi="Courier New" w:cs="Courier New"/>
         </w:rPr>
         <w:t>ceph balancer status</w:t>
       </w:r>
@@ -1160,10 +957,7 @@
       </w:pPr>
       <w:r>
         <w:rPr>
-          <w:rFonts w:ascii="Courier New" w:hAnsi="Courier New" w:eastAsia="Aptos" w:cs="Courier New" w:eastAsiaTheme="minorHAnsi"/>
-          <w:kern w:val="2"/>
-          <w:sz w:val="24"/>
-          <w:szCs w:val="24"/>
+          <w:rFonts w:ascii="Courier New" w:hAnsi="Courier New" w:cs="Courier New"/>
         </w:rPr>
         <w:t>ceph pg ls-by-osd 1</w:t>
       </w:r>
@@ -1172,15 +966,12 @@
       <w:pPr>
         <w:spacing w:after="0"/>
         <w:rPr>
-          <w:rFonts w:ascii="Aptos Display" w:hAnsi="Aptos Display" w:cs="Courier New" w:asciiTheme="majorHAnsi" w:hAnsiTheme="majorHAnsi"/>
-        </w:rPr>
-      </w:pPr>
-      <w:r>
-        <w:rPr>
-          <w:rFonts w:ascii="Courier New" w:hAnsi="Courier New" w:eastAsia="Aptos" w:cs="Courier New" w:eastAsiaTheme="minorHAnsi"/>
-          <w:kern w:val="2"/>
-          <w:sz w:val="24"/>
-          <w:szCs w:val="24"/>
+          <w:rFonts w:asciiTheme="majorHAnsi" w:hAnsiTheme="majorHAnsi" w:cs="Courier New"/>
+        </w:rPr>
+      </w:pPr>
+      <w:r>
+        <w:rPr>
+          <w:rFonts w:ascii="Courier New" w:hAnsi="Courier New" w:cs="Courier New"/>
         </w:rPr>
         <w:t>ceph pg ls-by-primary 1</w:t>
       </w:r>
@@ -1188,32 +979,26 @@
     <w:p>
       <w:pPr>
         <w:rPr>
-          <w:rFonts w:ascii="Aptos Display" w:hAnsi="Aptos Display" w:cs="Courier New" w:asciiTheme="majorHAnsi" w:hAnsiTheme="majorHAnsi"/>
-        </w:rPr>
-      </w:pPr>
-      <w:r>
+          <w:rFonts w:asciiTheme="majorHAnsi" w:hAnsiTheme="majorHAnsi" w:cs="Courier New"/>
+        </w:rPr>
+      </w:pPr>
+      <w:r>
+        <w:rPr>
+          <w:rFonts w:asciiTheme="majorHAnsi" w:hAnsiTheme="majorHAnsi" w:cs="Courier New"/>
+        </w:rPr>
         <w:lastRenderedPageBreak/>
-        <w:rPr>
-          <w:rFonts w:ascii="Aptos Display" w:hAnsi="Aptos Display" w:eastAsia="Aptos" w:cs="Courier New" w:asciiTheme="majorHAnsi" w:hAnsiTheme="majorHAnsi" w:eastAsiaTheme="minorHAnsi"/>
-          <w:kern w:val="2"/>
-          <w:sz w:val="24"/>
-          <w:szCs w:val="24"/>
-        </w:rPr>
         <w:t>phải để unmanaged: true</w:t>
       </w:r>
     </w:p>
     <w:p>
       <w:pPr>
         <w:rPr>
-          <w:rFonts w:ascii="Aptos Display" w:hAnsi="Aptos Display" w:cs="Courier New" w:asciiTheme="majorHAnsi" w:hAnsiTheme="majorHAnsi"/>
-        </w:rPr>
-      </w:pPr>
-      <w:r>
-        <w:rPr>
-          <w:rFonts w:ascii="Aptos Display" w:hAnsi="Aptos Display" w:eastAsia="Aptos" w:cs="Courier New" w:asciiTheme="majorHAnsi" w:hAnsiTheme="majorHAnsi" w:eastAsiaTheme="minorHAnsi"/>
-          <w:kern w:val="2"/>
-          <w:sz w:val="24"/>
-          <w:szCs w:val="24"/>
+          <w:rFonts w:asciiTheme="majorHAnsi" w:hAnsiTheme="majorHAnsi" w:cs="Courier New"/>
+        </w:rPr>
+      </w:pPr>
+      <w:r>
+        <w:rPr>
+          <w:rFonts w:asciiTheme="majorHAnsi" w:hAnsiTheme="majorHAnsi" w:cs="Courier New"/>
         </w:rPr>
         <w:t>tắt balancer</w:t>
       </w:r>
@@ -1227,10 +1012,7 @@
       </w:pPr>
       <w:r>
         <w:rPr>
-          <w:rFonts w:ascii="Courier New" w:hAnsi="Courier New" w:eastAsia="Aptos" w:cs="Courier New" w:eastAsiaTheme="minorHAnsi"/>
-          <w:kern w:val="2"/>
-          <w:sz w:val="24"/>
-          <w:szCs w:val="24"/>
+          <w:rFonts w:ascii="Courier New" w:hAnsi="Courier New" w:cs="Courier New"/>
         </w:rPr>
         <w:t>ceph config set osd osd_crush_initial_weight 0</w:t>
       </w:r>
@@ -1244,10 +1026,7 @@
       </w:pPr>
       <w:r>
         <w:rPr>
-          <w:rFonts w:ascii="Courier New" w:hAnsi="Courier New" w:eastAsia="Aptos" w:cs="Courier New" w:eastAsiaTheme="minorHAnsi"/>
-          <w:kern w:val="2"/>
-          <w:sz w:val="24"/>
-          <w:szCs w:val="24"/>
+          <w:rFonts w:ascii="Courier New" w:hAnsi="Courier New" w:cs="Courier New"/>
         </w:rPr>
         <w:t>ceph balancer off</w:t>
       </w:r>
@@ -1261,10 +1040,7 @@
       </w:pPr>
       <w:r>
         <w:rPr>
-          <w:rFonts w:ascii="Courier New" w:hAnsi="Courier New" w:eastAsia="Aptos" w:cs="Courier New" w:eastAsiaTheme="minorHAnsi"/>
-          <w:kern w:val="2"/>
-          <w:sz w:val="24"/>
-          <w:szCs w:val="24"/>
+          <w:rFonts w:ascii="Courier New" w:hAnsi="Courier New" w:cs="Courier New"/>
         </w:rPr>
         <w:t>ceph balancer status</w:t>
       </w:r>
@@ -1277,10 +1053,7 @@
       </w:pPr>
       <w:r>
         <w:rPr>
-          <w:rFonts w:ascii="Aptos Display" w:hAnsi="Aptos Display" w:eastAsia="Aptos" w:cs="Courier New" w:eastAsiaTheme="minorHAnsi"/>
-          <w:kern w:val="2"/>
-          <w:sz w:val="24"/>
-          <w:szCs w:val="24"/>
+          <w:rFonts w:ascii="Aptos Display" w:hAnsi="Aptos Display" w:cs="Courier New"/>
         </w:rPr>
         <w:t xml:space="preserve">rồi bắt đầu add osd </w:t>
       </w:r>
@@ -1293,10 +1066,7 @@
       </w:pPr>
       <w:r>
         <w:rPr>
-          <w:rFonts w:ascii="Aptos Display" w:hAnsi="Aptos Display" w:eastAsia="Aptos" w:cs="Courier New" w:eastAsiaTheme="minorHAnsi"/>
-          <w:kern w:val="2"/>
-          <w:sz w:val="24"/>
-          <w:szCs w:val="24"/>
+          <w:rFonts w:ascii="Aptos Display" w:hAnsi="Aptos Display" w:cs="Courier New"/>
         </w:rPr>
         <w:t>additional : phải tắt pg autoscale</w:t>
       </w:r>
@@ -1309,10 +1079,7 @@
       </w:pPr>
       <w:r>
         <w:rPr>
-          <w:rFonts w:ascii="Courier New" w:hAnsi="Courier New" w:eastAsia="Aptos" w:cs="Courier New" w:eastAsiaTheme="minorHAnsi"/>
-          <w:kern w:val="2"/>
-          <w:sz w:val="24"/>
-          <w:szCs w:val="24"/>
+          <w:rFonts w:ascii="Courier New" w:hAnsi="Courier New" w:cs="Courier New"/>
         </w:rPr>
         <w:t>ceph osd pool autoscale-status \</w:t>
       </w:r>
@@ -1325,10 +1092,7 @@
       </w:pPr>
       <w:r>
         <w:rPr>
-          <w:rFonts w:ascii="Courier New" w:hAnsi="Courier New" w:eastAsia="Aptos" w:cs="Courier New" w:eastAsiaTheme="minorHAnsi"/>
-          <w:kern w:val="2"/>
-          <w:sz w:val="24"/>
-          <w:szCs w:val="24"/>
+          <w:rFonts w:ascii="Courier New" w:hAnsi="Courier New" w:cs="Courier New"/>
         </w:rPr>
         <w:t xml:space="preserve">  &gt; "$EVIDENCE/58-autoscale-before-freeze.txt"</w:t>
       </w:r>
@@ -1341,10 +1105,7 @@
       </w:pPr>
       <w:r>
         <w:rPr>
-          <w:rFonts w:ascii="Courier New" w:hAnsi="Courier New" w:eastAsia="Aptos" w:cs="Courier New" w:eastAsiaTheme="minorHAnsi"/>
-          <w:kern w:val="2"/>
-          <w:sz w:val="24"/>
-          <w:szCs w:val="24"/>
+          <w:rFonts w:ascii="Courier New" w:hAnsi="Courier New" w:cs="Courier New"/>
         </w:rPr>
         <w:t>for POOL in $(ceph osd pool ls); do</w:t>
       </w:r>
@@ -1357,10 +1118,7 @@
       </w:pPr>
       <w:r>
         <w:rPr>
-          <w:rFonts w:ascii="Courier New" w:hAnsi="Courier New" w:eastAsia="Aptos" w:cs="Courier New" w:eastAsiaTheme="minorHAnsi"/>
-          <w:kern w:val="2"/>
-          <w:sz w:val="24"/>
-          <w:szCs w:val="24"/>
+          <w:rFonts w:ascii="Courier New" w:hAnsi="Courier New" w:cs="Courier New"/>
         </w:rPr>
         <w:t xml:space="preserve">    ceph osd pool set "$POOL" pg_autoscale_mode off</w:t>
       </w:r>
@@ -1373,10 +1131,7 @@
       </w:pPr>
       <w:r>
         <w:rPr>
-          <w:rFonts w:ascii="Courier New" w:hAnsi="Courier New" w:eastAsia="Aptos" w:cs="Courier New" w:eastAsiaTheme="minorHAnsi"/>
-          <w:kern w:val="2"/>
-          <w:sz w:val="24"/>
-          <w:szCs w:val="24"/>
+          <w:rFonts w:ascii="Courier New" w:hAnsi="Courier New" w:cs="Courier New"/>
         </w:rPr>
         <w:t>done</w:t>
       </w:r>
@@ -1389,10 +1144,7 @@
       </w:pPr>
       <w:r>
         <w:rPr>
-          <w:rFonts w:ascii="Courier New" w:hAnsi="Courier New" w:eastAsia="Aptos" w:cs="Courier New" w:eastAsiaTheme="minorHAnsi"/>
-          <w:kern w:val="2"/>
-          <w:sz w:val="24"/>
-          <w:szCs w:val="24"/>
+          <w:rFonts w:ascii="Courier New" w:hAnsi="Courier New" w:cs="Courier New"/>
         </w:rPr>
         <w:t>ceph osd pool autoscale-status \</w:t>
       </w:r>
@@ -1405,10 +1157,7 @@
       </w:pPr>
       <w:r>
         <w:rPr>
-          <w:rFonts w:ascii="Courier New" w:hAnsi="Courier New" w:eastAsia="Aptos" w:cs="Courier New" w:eastAsiaTheme="minorHAnsi"/>
-          <w:kern w:val="2"/>
-          <w:sz w:val="24"/>
-          <w:szCs w:val="24"/>
+          <w:rFonts w:ascii="Courier New" w:hAnsi="Courier New" w:cs="Courier New"/>
         </w:rPr>
         <w:t xml:space="preserve">  &gt; "$EVIDENCE/59-autoscale-after-freeze.txt"</w:t>
       </w:r>
@@ -1421,10 +1170,7 @@
       </w:pPr>
       <w:r>
         <w:rPr>
-          <w:rFonts w:ascii="Courier New" w:hAnsi="Courier New" w:eastAsia="Aptos" w:cs="Courier New" w:eastAsiaTheme="minorHAnsi"/>
-          <w:kern w:val="2"/>
-          <w:sz w:val="24"/>
-          <w:szCs w:val="24"/>
+          <w:rFonts w:ascii="Courier New" w:hAnsi="Courier New" w:cs="Courier New"/>
         </w:rPr>
         <w:t>ceph orch daemon add osd ${S_HOST}:${S_DEV} (osd S backup)</w:t>
       </w:r>
@@ -1436,8 +1182,11 @@
         </w:rPr>
       </w:pPr>
       <w:r>
+        <w:rPr>
+          <w:noProof/>
+        </w:rPr>
         <w:drawing>
-          <wp:inline distT="0" distB="0" distL="0" distR="0">
+          <wp:inline distT="0" distB="0" distL="0" distR="0" wp14:anchorId="6D71B2C4" wp14:editId="3DE3F241">
             <wp:extent cx="5943600" cy="1743075"/>
             <wp:effectExtent l="0" t="0" r="0" b="9525"/>
             <wp:docPr id="100000" name="Picture 100000"/>
@@ -1452,7 +1201,7 @@
                     <pic:cNvPicPr/>
                   </pic:nvPicPr>
                   <pic:blipFill>
-                    <a:blip r:embed="rId22"/>
+                    <a:blip r:embed="rId5"/>
                     <a:stretch>
                       <a:fillRect/>
                     </a:stretch>
@@ -1481,35 +1230,20 @@
       </w:pPr>
       <w:r>
         <w:rPr>
-          <w:rFonts w:ascii="ap" w:hAnsi="ap" w:eastAsia="Aptos" w:cs="Courier New" w:eastAsiaTheme="minorHAnsi"/>
-          <w:kern w:val="2"/>
-          <w:sz w:val="24"/>
-          <w:szCs w:val="24"/>
-        </w:rPr>
-        <w:t xml:space="preserve">Trả </w:t>
-      </w:r>
-      <w:r>
-        <w:rPr>
-          <w:rFonts w:ascii="ap" w:hAnsi="ap" w:eastAsia="Aptos" w:cs="Courier New" w:eastAsiaTheme="minorHAnsi"/>
-          <w:kern w:val="2"/>
-          <w:sz w:val="24"/>
-          <w:szCs w:val="24"/>
-        </w:rPr>
-        <w:t>initial</w:t>
-      </w:r>
-    </w:p>
-    <w:p>
-      <w:pPr>
-        <w:rPr>
-          <w:rFonts w:ascii="Courier New" w:hAnsi="Courier New" w:cs="Courier New"/>
-        </w:rPr>
-      </w:pPr>
-      <w:r>
-        <w:rPr>
-          <w:rFonts w:ascii="Courier New" w:hAnsi="Courier New" w:eastAsia="Aptos" w:cs="Courier New" w:eastAsiaTheme="minorHAnsi"/>
-          <w:kern w:val="2"/>
-          <w:sz w:val="24"/>
-          <w:szCs w:val="24"/>
+          <w:rFonts w:ascii="ap" w:hAnsi="ap" w:cs="Courier New"/>
+        </w:rPr>
+        <w:t>Trả initial</w:t>
+      </w:r>
+    </w:p>
+    <w:p>
+      <w:pPr>
+        <w:rPr>
+          <w:rFonts w:ascii="Courier New" w:hAnsi="Courier New" w:cs="Courier New"/>
+        </w:rPr>
+      </w:pPr>
+      <w:r>
+        <w:rPr>
+          <w:rFonts w:ascii="Courier New" w:hAnsi="Courier New" w:cs="Courier New"/>
         </w:rPr>
         <w:t>ceph config rm osd osd_crush_initial_weight</w:t>
       </w:r>
@@ -1529,10 +1263,7 @@
       </w:pPr>
       <w:r>
         <w:rPr>
-          <w:rFonts w:ascii="Aptos" w:hAnsi="Aptos" w:eastAsia="Aptos" w:cs="Courier New" w:eastAsiaTheme="minorHAnsi"/>
-          <w:kern w:val="2"/>
-          <w:sz w:val="24"/>
-          <w:szCs w:val="24"/>
+          <w:rFonts w:ascii="Aptos" w:hAnsi="Aptos" w:cs="Courier New"/>
         </w:rPr>
         <w:t>as is m1</w:t>
       </w:r>
@@ -1546,10 +1277,7 @@
       </w:pPr>
       <w:r>
         <w:rPr>
-          <w:rFonts w:ascii="Courier New" w:hAnsi="Courier New" w:eastAsia="Aptos" w:cs="Courier New" w:eastAsiaTheme="minorHAnsi"/>
-          <w:kern w:val="2"/>
-          <w:sz w:val="24"/>
-          <w:szCs w:val="24"/>
+          <w:rFonts w:ascii="Courier New" w:hAnsi="Courier New" w:cs="Courier New"/>
         </w:rPr>
         <w:t>EVIDENCE=~/pa1-prelab-20260923-090845</w:t>
       </w:r>
@@ -1563,10 +1291,7 @@
       </w:pPr>
       <w:r>
         <w:rPr>
-          <w:rFonts w:ascii="Courier New" w:hAnsi="Courier New" w:eastAsia="Aptos" w:cs="Courier New" w:eastAsiaTheme="minorHAnsi"/>
-          <w:kern w:val="2"/>
-          <w:sz w:val="24"/>
-          <w:szCs w:val="24"/>
+          <w:rFonts w:ascii="Courier New" w:hAnsi="Courier New" w:cs="Courier New"/>
         </w:rPr>
         <w:t>ceph -s &gt; "$EVIDENCE/21-after-S-ceph-s.txt"</w:t>
       </w:r>
@@ -1580,10 +1305,7 @@
       </w:pPr>
       <w:r>
         <w:rPr>
-          <w:rFonts w:ascii="Courier New" w:hAnsi="Courier New" w:eastAsia="Aptos" w:cs="Courier New" w:eastAsiaTheme="minorHAnsi"/>
-          <w:kern w:val="2"/>
-          <w:sz w:val="24"/>
-          <w:szCs w:val="24"/>
+          <w:rFonts w:ascii="Courier New" w:hAnsi="Courier New" w:cs="Courier New"/>
         </w:rPr>
         <w:t>ceph osd tree &gt; "$EVIDENCE/22-after-S-tree.txt"</w:t>
       </w:r>
@@ -1597,10 +1319,7 @@
       </w:pPr>
       <w:r>
         <w:rPr>
-          <w:rFonts w:ascii="Courier New" w:hAnsi="Courier New" w:eastAsia="Aptos" w:cs="Courier New" w:eastAsiaTheme="minorHAnsi"/>
-          <w:kern w:val="2"/>
-          <w:sz w:val="24"/>
-          <w:szCs w:val="24"/>
+          <w:rFonts w:ascii="Courier New" w:hAnsi="Courier New" w:cs="Courier New"/>
         </w:rPr>
         <w:t>ceph osd df tree &gt; "$EVIDENCE/23-after-S-df.txt"</w:t>
       </w:r>
@@ -1613,13 +1332,10 @@
         </w:rPr>
       </w:pPr>
       <w:r>
+        <w:rPr>
+          <w:rFonts w:ascii="Courier New" w:hAnsi="Courier New" w:cs="Courier New"/>
+        </w:rPr>
         <w:lastRenderedPageBreak/>
-        <w:rPr>
-          <w:rFonts w:ascii="Courier New" w:hAnsi="Courier New" w:eastAsia="Aptos" w:cs="Courier New" w:eastAsiaTheme="minorHAnsi"/>
-          <w:kern w:val="2"/>
-          <w:sz w:val="24"/>
-          <w:szCs w:val="24"/>
-        </w:rPr>
         <w:t>ceph osd dump &gt; "$EVIDENCE/24-after-S-osd-dump.txt"</w:t>
       </w:r>
     </w:p>
@@ -1632,10 +1348,7 @@
       </w:pPr>
       <w:r>
         <w:rPr>
-          <w:rFonts w:ascii="Courier New" w:hAnsi="Courier New" w:eastAsia="Aptos" w:cs="Courier New" w:eastAsiaTheme="minorHAnsi"/>
-          <w:kern w:val="2"/>
-          <w:sz w:val="24"/>
-          <w:szCs w:val="24"/>
+          <w:rFonts w:ascii="Courier New" w:hAnsi="Courier New" w:cs="Courier New"/>
         </w:rPr>
         <w:t>ceph osd getmap -o "$EVIDENCE/25-osdmap-S-weight0.bin"</w:t>
       </w:r>
@@ -1649,10 +1362,7 @@
       </w:pPr>
       <w:r>
         <w:rPr>
-          <w:rFonts w:ascii="Courier New" w:hAnsi="Courier New" w:eastAsia="Aptos" w:cs="Courier New" w:eastAsiaTheme="minorHAnsi"/>
-          <w:kern w:val="2"/>
-          <w:sz w:val="24"/>
-          <w:szCs w:val="24"/>
+          <w:rFonts w:ascii="Courier New" w:hAnsi="Courier New" w:cs="Courier New"/>
         </w:rPr>
         <w:t>ceph osd getcrushmap -o "$EVIDENCE/26-crush-S-weight0.bin"</w:t>
       </w:r>
@@ -1666,10 +1376,7 @@
       </w:pPr>
       <w:r>
         <w:rPr>
-          <w:rFonts w:ascii="Courier New" w:hAnsi="Courier New" w:eastAsia="Aptos" w:cs="Courier New" w:eastAsiaTheme="minorHAnsi"/>
-          <w:kern w:val="2"/>
-          <w:sz w:val="24"/>
-          <w:szCs w:val="24"/>
+          <w:rFonts w:ascii="Courier New" w:hAnsi="Courier New" w:cs="Courier New"/>
         </w:rPr>
         <w:t>ceph pg dump pgs &gt; "$EVIDENCE/27-pgs-S-weight0.txt"</w:t>
       </w:r>
@@ -1683,10 +1390,7 @@
       </w:pPr>
       <w:r>
         <w:rPr>
-          <w:rFonts w:ascii="Courier New" w:hAnsi="Courier New" w:eastAsia="Aptos" w:cs="Courier New" w:eastAsiaTheme="minorHAnsi"/>
-          <w:kern w:val="2"/>
-          <w:sz w:val="24"/>
-          <w:szCs w:val="24"/>
+          <w:rFonts w:ascii="Courier New" w:hAnsi="Courier New" w:cs="Courier New"/>
         </w:rPr>
         <w:t>ceph pg ls-by-osd $S &gt; "$EVIDENCE/28-S-pgs-weight0.txt"</w:t>
       </w:r>
@@ -1700,10 +1404,7 @@
       </w:pPr>
       <w:r>
         <w:rPr>
-          <w:rFonts w:ascii="Aptos" w:hAnsi="Aptos" w:eastAsia="Aptos" w:cs="Courier New" w:eastAsiaTheme="minorHAnsi"/>
-          <w:kern w:val="2"/>
-          <w:sz w:val="24"/>
-          <w:szCs w:val="24"/>
+          <w:rFonts w:ascii="Aptos" w:hAnsi="Aptos" w:cs="Courier New"/>
         </w:rPr>
         <w:t>rồi giờ tạo giả lập mô phỏng với S</w:t>
       </w:r>
@@ -1717,10 +1418,7 @@
       </w:pPr>
       <w:r>
         <w:rPr>
-          <w:rFonts w:ascii="Courier New" w:hAnsi="Courier New" w:eastAsia="Aptos" w:cs="Courier New" w:eastAsiaTheme="minorHAnsi"/>
-          <w:kern w:val="2"/>
-          <w:sz w:val="24"/>
-          <w:szCs w:val="24"/>
+          <w:rFonts w:ascii="Courier New" w:hAnsi="Courier New" w:cs="Courier New"/>
         </w:rPr>
         <w:t>ceph osd crush reweight osd.$S 0.0001</w:t>
       </w:r>
@@ -1734,10 +1432,7 @@
       </w:pPr>
       <w:r>
         <w:rPr>
-          <w:rFonts w:ascii="Courier New" w:hAnsi="Courier New" w:eastAsia="Aptos" w:cs="Courier New" w:eastAsiaTheme="minorHAnsi"/>
-          <w:kern w:val="2"/>
-          <w:sz w:val="24"/>
-          <w:szCs w:val="24"/>
+          <w:rFonts w:ascii="Courier New" w:hAnsi="Courier New" w:cs="Courier New"/>
         </w:rPr>
         <w:t>cp "$EVIDENCE/25-osdmap-S-weight0.bin" \</w:t>
       </w:r>
@@ -1751,10 +1446,7 @@
       </w:pPr>
       <w:r>
         <w:rPr>
-          <w:rFonts w:ascii="Courier New" w:hAnsi="Courier New" w:eastAsia="Aptos" w:cs="Courier New" w:eastAsiaTheme="minorHAnsi"/>
-          <w:kern w:val="2"/>
-          <w:sz w:val="24"/>
-          <w:szCs w:val="24"/>
+          <w:rFonts w:ascii="Courier New" w:hAnsi="Courier New" w:cs="Courier New"/>
         </w:rPr>
         <w:t xml:space="preserve">   "$EVIDENCE/29-osdmap-S-small.bin"</w:t>
       </w:r>
@@ -1768,10 +1460,7 @@
       </w:pPr>
       <w:r>
         <w:rPr>
-          <w:rFonts w:ascii="Courier New" w:hAnsi="Courier New" w:eastAsia="Aptos" w:cs="Courier New" w:eastAsiaTheme="minorHAnsi"/>
-          <w:kern w:val="2"/>
-          <w:sz w:val="24"/>
-          <w:szCs w:val="24"/>
+          <w:rFonts w:ascii="Courier New" w:hAnsi="Courier New" w:cs="Courier New"/>
         </w:rPr>
         <w:t>osdmaptool "$EVIDENCE/29-osdmap-S-small.bin" \</w:t>
       </w:r>
@@ -1785,10 +1474,7 @@
       </w:pPr>
       <w:r>
         <w:rPr>
-          <w:rFonts w:ascii="Courier New" w:hAnsi="Courier New" w:eastAsia="Aptos" w:cs="Courier New" w:eastAsiaTheme="minorHAnsi"/>
-          <w:kern w:val="2"/>
-          <w:sz w:val="24"/>
-          <w:szCs w:val="24"/>
+          <w:rFonts w:ascii="Courier New" w:hAnsi="Courier New" w:cs="Courier New"/>
         </w:rPr>
         <w:t xml:space="preserve">  --adjust-crush-weight ${S}:0.0001 \</w:t>
       </w:r>
@@ -1802,10 +1488,7 @@
       </w:pPr>
       <w:r>
         <w:rPr>
-          <w:rFonts w:ascii="Courier New" w:hAnsi="Courier New" w:eastAsia="Aptos" w:cs="Courier New" w:eastAsiaTheme="minorHAnsi"/>
-          <w:kern w:val="2"/>
-          <w:sz w:val="24"/>
-          <w:szCs w:val="24"/>
+          <w:rFonts w:ascii="Courier New" w:hAnsi="Courier New" w:cs="Courier New"/>
         </w:rPr>
         <w:t xml:space="preserve">  --save</w:t>
       </w:r>
@@ -1819,10 +1502,7 @@
       </w:pPr>
       <w:r>
         <w:rPr>
-          <w:rFonts w:ascii="Aptos" w:hAnsi="Aptos" w:eastAsia="Aptos" w:cs="Courier New" w:eastAsiaTheme="minorHAnsi"/>
-          <w:kern w:val="2"/>
-          <w:sz w:val="24"/>
-          <w:szCs w:val="24"/>
+          <w:rFonts w:ascii="Aptos" w:hAnsi="Aptos" w:cs="Courier New"/>
         </w:rPr>
         <w:t>Simulation luôn với weight của 25 29</w:t>
       </w:r>
@@ -1836,10 +1516,7 @@
       </w:pPr>
       <w:r>
         <w:rPr>
-          <w:rFonts w:ascii="Courier New" w:hAnsi="Courier New" w:eastAsia="Aptos" w:cs="Courier New" w:eastAsiaTheme="minorHAnsi"/>
-          <w:kern w:val="2"/>
-          <w:sz w:val="24"/>
-          <w:szCs w:val="24"/>
+          <w:rFonts w:ascii="Courier New" w:hAnsi="Courier New" w:cs="Courier New"/>
         </w:rPr>
         <w:t>osdmaptool "$EVIDENCE/25-osdmap-S-weight0.bin" \</w:t>
       </w:r>
@@ -1853,10 +1530,7 @@
       </w:pPr>
       <w:r>
         <w:rPr>
-          <w:rFonts w:ascii="Courier New" w:hAnsi="Courier New" w:eastAsia="Aptos" w:cs="Courier New" w:eastAsiaTheme="minorHAnsi"/>
-          <w:kern w:val="2"/>
-          <w:sz w:val="24"/>
-          <w:szCs w:val="24"/>
+          <w:rFonts w:ascii="Courier New" w:hAnsi="Courier New" w:cs="Courier New"/>
         </w:rPr>
         <w:t xml:space="preserve">  --test-map-pgs \</w:t>
       </w:r>
@@ -1870,10 +1544,7 @@
       </w:pPr>
       <w:r>
         <w:rPr>
-          <w:rFonts w:ascii="Courier New" w:hAnsi="Courier New" w:eastAsia="Aptos" w:cs="Courier New" w:eastAsiaTheme="minorHAnsi"/>
-          <w:kern w:val="2"/>
-          <w:sz w:val="24"/>
-          <w:szCs w:val="24"/>
+          <w:rFonts w:ascii="Courier New" w:hAnsi="Courier New" w:cs="Courier New"/>
         </w:rPr>
         <w:t xml:space="preserve">  &gt; "$EVIDENCE/30-map-weight0.txt" 2&gt;&amp;1</w:t>
       </w:r>
@@ -1895,10 +1566,7 @@
       </w:pPr>
       <w:r>
         <w:rPr>
-          <w:rFonts w:ascii="Courier New" w:hAnsi="Courier New" w:eastAsia="Aptos" w:cs="Courier New" w:eastAsiaTheme="minorHAnsi"/>
-          <w:kern w:val="2"/>
-          <w:sz w:val="24"/>
-          <w:szCs w:val="24"/>
+          <w:rFonts w:ascii="Courier New" w:hAnsi="Courier New" w:cs="Courier New"/>
         </w:rPr>
         <w:t>osdmaptool "$EVIDENCE/29-osdmap-S-small.bin" \</w:t>
       </w:r>
@@ -1912,10 +1580,7 @@
       </w:pPr>
       <w:r>
         <w:rPr>
-          <w:rFonts w:ascii="Courier New" w:hAnsi="Courier New" w:eastAsia="Aptos" w:cs="Courier New" w:eastAsiaTheme="minorHAnsi"/>
-          <w:kern w:val="2"/>
-          <w:sz w:val="24"/>
-          <w:szCs w:val="24"/>
+          <w:rFonts w:ascii="Courier New" w:hAnsi="Courier New" w:cs="Courier New"/>
         </w:rPr>
         <w:t xml:space="preserve">  --test-map-pgs \</w:t>
       </w:r>
@@ -1929,10 +1594,7 @@
       </w:pPr>
       <w:r>
         <w:rPr>
-          <w:rFonts w:ascii="Courier New" w:hAnsi="Courier New" w:eastAsia="Aptos" w:cs="Courier New" w:eastAsiaTheme="minorHAnsi"/>
-          <w:kern w:val="2"/>
-          <w:sz w:val="24"/>
-          <w:szCs w:val="24"/>
+          <w:rFonts w:ascii="Courier New" w:hAnsi="Courier New" w:cs="Courier New"/>
         </w:rPr>
         <w:t xml:space="preserve">  &gt; "$EVIDENCE/31-map-small.txt" 2&gt;&amp;1</w:t>
       </w:r>
@@ -1954,10 +1616,7 @@
       </w:pPr>
       <w:r>
         <w:rPr>
-          <w:rFonts w:ascii="Aptos" w:hAnsi="Aptos" w:eastAsia="Aptos" w:cs="Courier New" w:eastAsiaTheme="minorHAnsi"/>
-          <w:kern w:val="2"/>
-          <w:sz w:val="24"/>
-          <w:szCs w:val="24"/>
+          <w:rFonts w:ascii="Aptos" w:hAnsi="Aptos" w:cs="Courier New"/>
         </w:rPr>
         <w:t>Diff</w:t>
       </w:r>
@@ -1971,10 +1630,7 @@
       </w:pPr>
       <w:r>
         <w:rPr>
-          <w:rFonts w:ascii="Courier New" w:hAnsi="Courier New" w:eastAsia="Aptos" w:cs="Courier New" w:eastAsiaTheme="minorHAnsi"/>
-          <w:kern w:val="2"/>
-          <w:sz w:val="24"/>
-          <w:szCs w:val="24"/>
+          <w:rFonts w:ascii="Courier New" w:hAnsi="Courier New" w:cs="Courier New"/>
         </w:rPr>
         <w:t>diff -u \</w:t>
       </w:r>
@@ -1988,10 +1644,7 @@
       </w:pPr>
       <w:r>
         <w:rPr>
-          <w:rFonts w:ascii="Courier New" w:hAnsi="Courier New" w:eastAsia="Aptos" w:cs="Courier New" w:eastAsiaTheme="minorHAnsi"/>
-          <w:kern w:val="2"/>
-          <w:sz w:val="24"/>
-          <w:szCs w:val="24"/>
+          <w:rFonts w:ascii="Courier New" w:hAnsi="Courier New" w:cs="Courier New"/>
         </w:rPr>
         <w:t xml:space="preserve">  "$EVIDENCE/30-map-weight0.txt" \</w:t>
       </w:r>
@@ -2005,10 +1658,7 @@
       </w:pPr>
       <w:r>
         <w:rPr>
-          <w:rFonts w:ascii="Courier New" w:hAnsi="Courier New" w:eastAsia="Aptos" w:cs="Courier New" w:eastAsiaTheme="minorHAnsi"/>
-          <w:kern w:val="2"/>
-          <w:sz w:val="24"/>
-          <w:szCs w:val="24"/>
+          <w:rFonts w:ascii="Courier New" w:hAnsi="Courier New" w:cs="Courier New"/>
         </w:rPr>
         <w:t xml:space="preserve">  "$EVIDENCE/31-map-small.txt" \</w:t>
       </w:r>
@@ -2021,8 +1671,11 @@
         </w:rPr>
       </w:pPr>
       <w:r>
+        <w:rPr>
+          <w:noProof/>
+        </w:rPr>
         <w:drawing>
-          <wp:anchor distT="0" distB="0" distL="114300" distR="114300" simplePos="0" relativeHeight="251658240" behindDoc="0" locked="0" layoutInCell="1" allowOverlap="1">
+          <wp:anchor distT="0" distB="0" distL="114300" distR="114300" simplePos="0" relativeHeight="251651072" behindDoc="0" locked="0" layoutInCell="1" allowOverlap="1" wp14:anchorId="6CD17490" wp14:editId="3A71A70F">
             <wp:simplePos x="0" y="0"/>
             <wp:positionH relativeFrom="column">
               <wp:posOffset>-78639</wp:posOffset>
@@ -2045,7 +1698,7 @@
                     <pic:cNvPicPr/>
                   </pic:nvPicPr>
                   <pic:blipFill>
-                    <a:blip r:embed="rId23"/>
+                    <a:blip r:embed="rId6"/>
                     <a:stretch>
                       <a:fillRect/>
                     </a:stretch>
@@ -2067,10 +1720,7 @@
       </w:r>
       <w:r>
         <w:rPr>
-          <w:rFonts w:ascii="Courier New" w:hAnsi="Courier New" w:eastAsia="Aptos" w:cs="Courier New" w:eastAsiaTheme="minorHAnsi"/>
-          <w:kern w:val="2"/>
-          <w:sz w:val="24"/>
-          <w:szCs w:val="24"/>
+          <w:rFonts w:ascii="Courier New" w:hAnsi="Courier New" w:cs="Courier New"/>
         </w:rPr>
         <w:t xml:space="preserve">  | tee "$EVIDENCE/32-map-diff.txt"</w:t>
       </w:r>
@@ -2092,76 +1742,46 @@
       </w:pPr>
       <w:r>
         <w:rPr>
-          <w:rFonts w:ascii="Aptos" w:hAnsi="Aptos" w:eastAsia="Aptos" w:cs="Courier New" w:eastAsiaTheme="minorHAnsi"/>
-          <w:kern w:val="2"/>
-          <w:sz w:val="24"/>
-          <w:szCs w:val="24"/>
-        </w:rPr>
-        <w:t xml:space="preserve">Để weight thành 0.001 để cho </w:t>
-      </w:r>
-      <w:r>
-        <w:rPr>
-          <w:rFonts w:ascii="Aptos" w:hAnsi="Aptos" w:eastAsia="Aptos" w:cs="Courier New" w:eastAsiaTheme="minorHAnsi"/>
-          <w:kern w:val="2"/>
-          <w:sz w:val="24"/>
-          <w:szCs w:val="24"/>
-        </w:rPr>
-        <w:t>Vì `pg-upmap-items` tới một OSD có effective weight bằng 0 có thể bị MON coi là mapping không hợp lệ, S phải có weight dương khi thật sự nhận PG.</w:t>
-      </w:r>
-    </w:p>
-    <w:p>
-      <w:pPr>
-        <w:spacing w:after="0"/>
-        <w:rPr>
-          <w:rFonts w:ascii="Courier New" w:hAnsi="Courier New" w:cs="Courier New"/>
-        </w:rPr>
-      </w:pPr>
-      <w:r>
-        <w:rPr>
-          <w:rFonts w:ascii="Courier New" w:hAnsi="Courier New" w:eastAsia="Aptos" w:cs="Courier New" w:eastAsiaTheme="minorHAnsi"/>
-          <w:kern w:val="2"/>
-          <w:sz w:val="24"/>
-          <w:szCs w:val="24"/>
-        </w:rPr>
-        <w:t xml:space="preserve">ceph osd crush reweight </w:t>
-      </w:r>
-      <w:r>
-        <w:rPr>
-          <w:rFonts w:ascii="Courier New" w:hAnsi="Courier New" w:eastAsia="Aptos" w:cs="Courier New" w:eastAsiaTheme="minorHAnsi"/>
-          <w:kern w:val="2"/>
-          <w:sz w:val="24"/>
-          <w:szCs w:val="24"/>
-        </w:rPr>
-        <w:t>osd.$</w:t>
-      </w:r>
-      <w:r>
-        <w:rPr>
-          <w:rFonts w:ascii="Courier New" w:hAnsi="Courier New" w:eastAsia="Aptos" w:cs="Courier New" w:eastAsiaTheme="minorHAnsi"/>
-          <w:kern w:val="2"/>
-          <w:sz w:val="24"/>
-          <w:szCs w:val="24"/>
-        </w:rPr>
-        <w:t>S 0.0001</w:t>
-      </w:r>
-    </w:p>
-    <w:p>
-      <w:pPr>
-        <w:spacing w:after="0"/>
-        <w:rPr>
-          <w:rFonts w:ascii="Aptos" w:hAnsi="Aptos" w:cs="Courier New"/>
-        </w:rPr>
-      </w:pPr>
-    </w:p>
-    <w:p>
-      <w:pPr>
-        <w:spacing w:after="0"/>
-        <w:rPr>
-          <w:rFonts w:ascii="Aptos" w:hAnsi="Aptos" w:cs="Courier New"/>
-        </w:rPr>
-      </w:pPr>
-      <w:r>
+          <w:rFonts w:ascii="Aptos" w:hAnsi="Aptos" w:cs="Courier New"/>
+        </w:rPr>
+        <w:t>Để weight thành 0.001 để cho Vì `pg-upmap-items` tới một OSD có effective weight bằng 0 có thể bị MON coi là mapping không hợp lệ, S phải có weight dương khi thật sự nhận PG.</w:t>
+      </w:r>
+    </w:p>
+    <w:p>
+      <w:pPr>
+        <w:spacing w:after="0"/>
+        <w:rPr>
+          <w:rFonts w:ascii="Courier New" w:hAnsi="Courier New" w:cs="Courier New"/>
+        </w:rPr>
+      </w:pPr>
+      <w:r>
+        <w:rPr>
+          <w:rFonts w:ascii="Courier New" w:hAnsi="Courier New" w:cs="Courier New"/>
+        </w:rPr>
+        <w:t>ceph osd crush reweight osd.$S 0.0001</w:t>
+      </w:r>
+    </w:p>
+    <w:p>
+      <w:pPr>
+        <w:spacing w:after="0"/>
+        <w:rPr>
+          <w:rFonts w:ascii="Aptos" w:hAnsi="Aptos" w:cs="Courier New"/>
+        </w:rPr>
+      </w:pPr>
+    </w:p>
+    <w:p>
+      <w:pPr>
+        <w:spacing w:after="0"/>
+        <w:rPr>
+          <w:rFonts w:ascii="Aptos" w:hAnsi="Aptos" w:cs="Courier New"/>
+        </w:rPr>
+      </w:pPr>
+      <w:r>
+        <w:rPr>
+          <w:noProof/>
+        </w:rPr>
         <w:drawing>
-          <wp:anchor distT="0" distB="0" distL="114300" distR="114300" simplePos="0" relativeHeight="251658240" behindDoc="0" locked="0" layoutInCell="1" allowOverlap="1">
+          <wp:anchor distT="0" distB="0" distL="114300" distR="114300" simplePos="0" relativeHeight="251652096" behindDoc="0" locked="0" layoutInCell="1" allowOverlap="1" wp14:anchorId="3522AFE9" wp14:editId="0EC33FBC">
             <wp:simplePos x="0" y="0"/>
             <wp:positionH relativeFrom="column">
               <wp:posOffset>-6484</wp:posOffset>
@@ -2184,7 +1804,7 @@
                     <pic:cNvPicPr/>
                   </pic:nvPicPr>
                   <pic:blipFill>
-                    <a:blip r:embed="rId24"/>
+                    <a:blip r:embed="rId7"/>
                     <a:stretch>
                       <a:fillRect/>
                     </a:stretch>
@@ -2206,10 +1826,7 @@
       </w:r>
       <w:r>
         <w:rPr>
-          <w:rFonts w:ascii="Aptos" w:hAnsi="Aptos" w:eastAsia="Aptos" w:cs="Courier New" w:eastAsiaTheme="minorHAnsi"/>
-          <w:kern w:val="2"/>
-          <w:sz w:val="24"/>
-          <w:szCs w:val="24"/>
+          <w:rFonts w:ascii="Aptos" w:hAnsi="Aptos" w:cs="Courier New"/>
         </w:rPr>
         <w:t>đã kiểm tra và chưa được gắn thêm với PG nào</w:t>
       </w:r>
@@ -2223,10 +1840,7 @@
       </w:pPr>
       <w:r>
         <w:rPr>
-          <w:rFonts w:ascii="Aptos" w:hAnsi="Aptos" w:eastAsia="Aptos" w:cs="Courier New" w:eastAsiaTheme="minorHAnsi"/>
-          <w:kern w:val="2"/>
-          <w:sz w:val="24"/>
-          <w:szCs w:val="24"/>
+          <w:rFonts w:ascii="Aptos" w:hAnsi="Aptos" w:cs="Courier New"/>
         </w:rPr>
         <w:t>Lưu primary hiện tại:</w:t>
       </w:r>
@@ -2240,10 +1854,7 @@
       </w:pPr>
       <w:r>
         <w:rPr>
-          <w:rFonts w:ascii="Courier New" w:hAnsi="Courier New" w:eastAsia="Aptos" w:cs="Courier New" w:eastAsiaTheme="minorHAnsi"/>
-          <w:kern w:val="2"/>
-          <w:sz w:val="24"/>
-          <w:szCs w:val="24"/>
+          <w:rFonts w:ascii="Courier New" w:hAnsi="Courier New" w:cs="Courier New"/>
         </w:rPr>
         <w:t>ceph pg ls-by-primary $X &gt; "$EVIDENCE/33-X-primary-before.txt"</w:t>
       </w:r>
@@ -2257,10 +1868,7 @@
       </w:pPr>
       <w:r>
         <w:rPr>
-          <w:rFonts w:ascii="Aptos" w:hAnsi="Aptos" w:eastAsia="Aptos" w:cs="Courier New" w:eastAsiaTheme="minorHAnsi"/>
-          <w:kern w:val="2"/>
-          <w:sz w:val="24"/>
-          <w:szCs w:val="24"/>
+          <w:rFonts w:ascii="Aptos" w:hAnsi="Aptos" w:cs="Courier New"/>
         </w:rPr>
         <w:t>Snapshot trước của bạn cho thấy osd.1 có khá nhiều primary, nên giờ:</w:t>
       </w:r>
@@ -2274,60 +1882,24 @@
       </w:pPr>
       <w:r>
         <w:rPr>
-          <w:rFonts w:ascii="Courier New" w:hAnsi="Courier New" w:eastAsia="Aptos" w:cs="Courier New" w:eastAsiaTheme="minorHAnsi"/>
-          <w:kern w:val="2"/>
-          <w:sz w:val="24"/>
-          <w:szCs w:val="24"/>
-        </w:rPr>
-        <w:t xml:space="preserve">ceph osd </w:t>
-      </w:r>
-      <w:r>
-        <w:rPr>
-          <w:rFonts w:ascii="Courier New" w:hAnsi="Courier New" w:eastAsia="Aptos" w:cs="Courier New" w:eastAsiaTheme="minorHAnsi"/>
-          <w:kern w:val="2"/>
-          <w:sz w:val="24"/>
-          <w:szCs w:val="24"/>
-        </w:rPr>
-        <w:t>primary-affinity</w:t>
-      </w:r>
-      <w:r>
-        <w:rPr>
-          <w:rFonts w:ascii="Courier New" w:hAnsi="Courier New" w:eastAsia="Aptos" w:cs="Courier New" w:eastAsiaTheme="minorHAnsi"/>
-          <w:kern w:val="2"/>
-          <w:sz w:val="24"/>
-          <w:szCs w:val="24"/>
-        </w:rPr>
-        <w:t xml:space="preserve"> </w:t>
-      </w:r>
-      <w:r>
-        <w:rPr>
-          <w:rFonts w:ascii="Courier New" w:hAnsi="Courier New" w:eastAsia="Aptos" w:cs="Courier New" w:eastAsiaTheme="minorHAnsi"/>
-          <w:kern w:val="2"/>
-          <w:sz w:val="24"/>
-          <w:szCs w:val="24"/>
-        </w:rPr>
-        <w:t>osd.$</w:t>
-      </w:r>
-      <w:r>
-        <w:rPr>
-          <w:rFonts w:ascii="Courier New" w:hAnsi="Courier New" w:eastAsia="Aptos" w:cs="Courier New" w:eastAsiaTheme="minorHAnsi"/>
-          <w:kern w:val="2"/>
-          <w:sz w:val="24"/>
-          <w:szCs w:val="24"/>
-        </w:rPr>
-        <w:t>X 0</w:t>
-      </w:r>
-    </w:p>
-    <w:p>
-      <w:pPr>
-        <w:spacing w:after="0"/>
-        <w:rPr>
-          <w:rFonts w:ascii="Courier New" w:hAnsi="Courier New" w:cs="Courier New"/>
-        </w:rPr>
-      </w:pPr>
-      <w:r>
+          <w:rFonts w:ascii="Courier New" w:hAnsi="Courier New" w:cs="Courier New"/>
+        </w:rPr>
+        <w:t>ceph osd primary-affinity osd.$X 0</w:t>
+      </w:r>
+    </w:p>
+    <w:p>
+      <w:pPr>
+        <w:spacing w:after="0"/>
+        <w:rPr>
+          <w:rFonts w:ascii="Courier New" w:hAnsi="Courier New" w:cs="Courier New"/>
+        </w:rPr>
+      </w:pPr>
+      <w:r>
+        <w:rPr>
+          <w:noProof/>
+        </w:rPr>
         <w:drawing>
-          <wp:anchor distT="0" distB="0" distL="114300" distR="114300" simplePos="0" relativeHeight="251658240" behindDoc="0" locked="0" layoutInCell="1" allowOverlap="1">
+          <wp:anchor distT="0" distB="0" distL="114300" distR="114300" simplePos="0" relativeHeight="251653120" behindDoc="0" locked="0" layoutInCell="1" allowOverlap="1" wp14:anchorId="7370CAB6" wp14:editId="491DA9E5">
             <wp:simplePos x="0" y="0"/>
             <wp:positionH relativeFrom="column">
               <wp:posOffset>0</wp:posOffset>
@@ -2350,7 +1922,7 @@
                     <pic:cNvPicPr/>
                   </pic:nvPicPr>
                   <pic:blipFill>
-                    <a:blip r:embed="rId25"/>
+                    <a:blip r:embed="rId8"/>
                     <a:stretch>
                       <a:fillRect/>
                     </a:stretch>
@@ -2372,10 +1944,7 @@
       </w:r>
       <w:r>
         <w:rPr>
-          <w:rFonts w:ascii="Courier New" w:hAnsi="Courier New" w:eastAsia="Aptos" w:cs="Courier New" w:eastAsiaTheme="minorHAnsi"/>
-          <w:kern w:val="2"/>
-          <w:sz w:val="24"/>
-          <w:szCs w:val="24"/>
+          <w:rFonts w:ascii="Courier New" w:hAnsi="Courier New" w:cs="Courier New"/>
         </w:rPr>
         <w:t>ceph osd primary-affinity osd.$S 0</w:t>
       </w:r>
@@ -2397,10 +1966,7 @@
       </w:pPr>
       <w:r>
         <w:rPr>
-          <w:rFonts w:ascii="Aptos" w:hAnsi="Aptos" w:eastAsia="Aptos" w:cs="Courier New" w:eastAsiaTheme="minorHAnsi"/>
-          <w:kern w:val="2"/>
-          <w:sz w:val="24"/>
-          <w:szCs w:val="24"/>
+          <w:rFonts w:ascii="Aptos" w:hAnsi="Aptos" w:cs="Courier New"/>
         </w:rPr>
         <w:t>chụp checkpoint</w:t>
       </w:r>
@@ -2414,10 +1980,7 @@
       </w:pPr>
       <w:r>
         <w:rPr>
-          <w:rFonts w:ascii="Courier New" w:hAnsi="Courier New" w:eastAsia="Aptos" w:cs="Courier New" w:eastAsiaTheme="minorHAnsi"/>
-          <w:kern w:val="2"/>
-          <w:sz w:val="24"/>
-          <w:szCs w:val="24"/>
+          <w:rFonts w:ascii="Courier New" w:hAnsi="Courier New" w:cs="Courier New"/>
         </w:rPr>
         <w:t>ceph osd tree &gt; "$EVIDENCE/34-after-primary-affinity-tree.txt"</w:t>
       </w:r>
@@ -2431,10 +1994,7 @@
       </w:pPr>
       <w:r>
         <w:rPr>
-          <w:rFonts w:ascii="Courier New" w:hAnsi="Courier New" w:eastAsia="Aptos" w:cs="Courier New" w:eastAsiaTheme="minorHAnsi"/>
-          <w:kern w:val="2"/>
-          <w:sz w:val="24"/>
-          <w:szCs w:val="24"/>
+          <w:rFonts w:ascii="Courier New" w:hAnsi="Courier New" w:cs="Courier New"/>
         </w:rPr>
         <w:t>ceph pg ls-by-primary $X &gt; "$EVIDENCE/35-X-primary-after.txt"</w:t>
       </w:r>
@@ -2448,10 +2008,7 @@
       </w:pPr>
       <w:r>
         <w:rPr>
-          <w:rFonts w:ascii="Courier New" w:hAnsi="Courier New" w:eastAsia="Aptos" w:cs="Courier New" w:eastAsiaTheme="minorHAnsi"/>
-          <w:kern w:val="2"/>
-          <w:sz w:val="24"/>
-          <w:szCs w:val="24"/>
+          <w:rFonts w:ascii="Courier New" w:hAnsi="Courier New" w:cs="Courier New"/>
         </w:rPr>
         <w:t>ceph -s &gt; "$EVIDENCE/36-after-primary-affinity-ceph-s.txt"</w:t>
       </w:r>
@@ -2473,10 +2030,7 @@
       </w:pPr>
       <w:r>
         <w:rPr>
-          <w:rFonts w:ascii="Courier New" w:hAnsi="Courier New" w:eastAsia="Aptos" w:cs="Courier New" w:eastAsiaTheme="minorHAnsi"/>
-          <w:kern w:val="2"/>
-          <w:sz w:val="24"/>
-          <w:szCs w:val="24"/>
+          <w:rFonts w:ascii="Courier New" w:hAnsi="Courier New" w:cs="Courier New"/>
         </w:rPr>
         <w:t>lưu mapping</w:t>
       </w:r>
@@ -2490,10 +2044,7 @@
       </w:pPr>
       <w:r>
         <w:rPr>
-          <w:rFonts w:ascii="Courier New" w:hAnsi="Courier New" w:eastAsia="Aptos" w:cs="Courier New" w:eastAsiaTheme="minorHAnsi"/>
-          <w:kern w:val="2"/>
-          <w:sz w:val="24"/>
-          <w:szCs w:val="24"/>
+          <w:rFonts w:ascii="Courier New" w:hAnsi="Courier New" w:cs="Courier New"/>
         </w:rPr>
         <w:t>ceph pg map $PG \</w:t>
       </w:r>
@@ -2507,10 +2058,7 @@
       </w:pPr>
       <w:r>
         <w:rPr>
-          <w:rFonts w:ascii="Courier New" w:hAnsi="Courier New" w:eastAsia="Aptos" w:cs="Courier New" w:eastAsiaTheme="minorHAnsi"/>
-          <w:kern w:val="2"/>
-          <w:sz w:val="24"/>
-          <w:szCs w:val="24"/>
+          <w:rFonts w:ascii="Courier New" w:hAnsi="Courier New" w:cs="Courier New"/>
         </w:rPr>
         <w:t xml:space="preserve">  | tee "$EVIDENCE/37-canary-${PG}-before.txt"</w:t>
       </w:r>
@@ -2540,10 +2088,7 @@
       </w:pPr>
       <w:r>
         <w:rPr>
-          <w:rFonts w:ascii="Aptos" w:hAnsi="Aptos" w:eastAsia="Aptos" w:cs="Courier New" w:eastAsiaTheme="minorHAnsi"/>
-          <w:kern w:val="2"/>
-          <w:sz w:val="24"/>
-          <w:szCs w:val="24"/>
+          <w:rFonts w:ascii="Aptos" w:hAnsi="Aptos" w:cs="Courier New"/>
         </w:rPr>
         <w:t>Canary 9.6(least affect one )</w:t>
       </w:r>
@@ -2557,10 +2102,7 @@
       </w:pPr>
       <w:r>
         <w:rPr>
-          <w:rFonts w:ascii="Courier New" w:hAnsi="Courier New" w:eastAsia="Aptos" w:cs="Courier New" w:eastAsiaTheme="minorHAnsi"/>
-          <w:kern w:val="2"/>
-          <w:sz w:val="24"/>
-          <w:szCs w:val="24"/>
+          <w:rFonts w:ascii="Courier New" w:hAnsi="Courier New" w:cs="Courier New"/>
         </w:rPr>
         <w:t>ceph osd pg-upmap-items $PG $X $S</w:t>
       </w:r>
@@ -2573,8 +2115,11 @@
         </w:rPr>
       </w:pPr>
       <w:r>
+        <w:rPr>
+          <w:noProof/>
+        </w:rPr>
         <w:drawing>
-          <wp:anchor distT="0" distB="0" distL="114300" distR="114300" simplePos="0" relativeHeight="251658240" behindDoc="0" locked="0" layoutInCell="1" allowOverlap="1">
+          <wp:anchor distT="0" distB="0" distL="114300" distR="114300" simplePos="0" relativeHeight="251654144" behindDoc="0" locked="0" layoutInCell="1" allowOverlap="1" wp14:anchorId="120B80C0" wp14:editId="5E56EEF6">
             <wp:simplePos x="0" y="0"/>
             <wp:positionH relativeFrom="column">
               <wp:posOffset>0</wp:posOffset>
@@ -2597,7 +2142,7 @@
                     <pic:cNvPicPr/>
                   </pic:nvPicPr>
                   <pic:blipFill>
-                    <a:blip r:embed="rId26"/>
+                    <a:blip r:embed="rId9"/>
                     <a:stretch>
                       <a:fillRect/>
                     </a:stretch>
@@ -2627,10 +2172,7 @@
       </w:pPr>
       <w:r>
         <w:rPr>
-          <w:rFonts w:ascii="Courier New" w:hAnsi="Courier New" w:eastAsia="Aptos" w:cs="Courier New" w:eastAsiaTheme="minorHAnsi"/>
-          <w:kern w:val="2"/>
-          <w:sz w:val="24"/>
-          <w:szCs w:val="24"/>
+          <w:rFonts w:ascii="Courier New" w:hAnsi="Courier New" w:cs="Courier New"/>
         </w:rPr>
         <w:t xml:space="preserve"> </w:t>
       </w:r>
@@ -2644,10 +2186,7 @@
       </w:pPr>
       <w:r>
         <w:rPr>
-          <w:rFonts w:ascii="Aptos" w:hAnsi="Aptos" w:eastAsia="Aptos" w:cs="Courier New" w:eastAsiaTheme="minorHAnsi"/>
-          <w:kern w:val="2"/>
-          <w:sz w:val="24"/>
-          <w:szCs w:val="24"/>
+          <w:rFonts w:ascii="Aptos" w:hAnsi="Aptos" w:cs="Courier New"/>
         </w:rPr>
         <w:t>chỉ có mỗi canary PG vừa làm</w:t>
       </w:r>
@@ -2669,10 +2208,7 @@
       </w:pPr>
       <w:r>
         <w:rPr>
-          <w:rFonts w:ascii="Aptos" w:hAnsi="Aptos" w:eastAsia="Aptos" w:cs="Courier New" w:eastAsiaTheme="minorHAnsi"/>
-          <w:kern w:val="2"/>
-          <w:sz w:val="24"/>
-          <w:szCs w:val="24"/>
+          <w:rFonts w:ascii="Aptos" w:hAnsi="Aptos" w:cs="Courier New"/>
         </w:rPr>
         <w:t>lưu lại</w:t>
       </w:r>
@@ -2686,10 +2222,7 @@
       </w:pPr>
       <w:r>
         <w:rPr>
-          <w:rFonts w:ascii="Courier New" w:hAnsi="Courier New" w:eastAsia="Aptos" w:cs="Courier New" w:eastAsiaTheme="minorHAnsi"/>
-          <w:kern w:val="2"/>
-          <w:sz w:val="24"/>
-          <w:szCs w:val="24"/>
+          <w:rFonts w:ascii="Courier New" w:hAnsi="Courier New" w:cs="Courier New"/>
         </w:rPr>
         <w:t>ceph pg map $PG \</w:t>
       </w:r>
@@ -2703,10 +2236,7 @@
       </w:pPr>
       <w:r>
         <w:rPr>
-          <w:rFonts w:ascii="Courier New" w:hAnsi="Courier New" w:eastAsia="Aptos" w:cs="Courier New" w:eastAsiaTheme="minorHAnsi"/>
-          <w:kern w:val="2"/>
-          <w:sz w:val="24"/>
-          <w:szCs w:val="24"/>
+          <w:rFonts w:ascii="Courier New" w:hAnsi="Courier New" w:cs="Courier New"/>
         </w:rPr>
         <w:t xml:space="preserve">  &gt; "$EVIDENCE/38-canary-${PG}-after.txt"</w:t>
       </w:r>
@@ -2728,10 +2258,7 @@
       </w:pPr>
       <w:r>
         <w:rPr>
-          <w:rFonts w:ascii="Courier New" w:hAnsi="Courier New" w:eastAsia="Aptos" w:cs="Courier New" w:eastAsiaTheme="minorHAnsi"/>
-          <w:kern w:val="2"/>
-          <w:sz w:val="24"/>
-          <w:szCs w:val="24"/>
+          <w:rFonts w:ascii="Courier New" w:hAnsi="Courier New" w:cs="Courier New"/>
         </w:rPr>
         <w:t>ceph pg ls-by-osd $S \</w:t>
       </w:r>
@@ -2745,10 +2272,7 @@
       </w:pPr>
       <w:r>
         <w:rPr>
-          <w:rFonts w:ascii="Courier New" w:hAnsi="Courier New" w:eastAsia="Aptos" w:cs="Courier New" w:eastAsiaTheme="minorHAnsi"/>
-          <w:kern w:val="2"/>
-          <w:sz w:val="24"/>
-          <w:szCs w:val="24"/>
+          <w:rFonts w:ascii="Courier New" w:hAnsi="Courier New" w:cs="Courier New"/>
         </w:rPr>
         <w:t xml:space="preserve">  &gt; "$EVIDENCE/39-S-pgs-after-canary.txt"</w:t>
       </w:r>
@@ -2770,10 +2294,7 @@
       </w:pPr>
       <w:r>
         <w:rPr>
-          <w:rFonts w:ascii="Courier New" w:hAnsi="Courier New" w:eastAsia="Aptos" w:cs="Courier New" w:eastAsiaTheme="minorHAnsi"/>
-          <w:kern w:val="2"/>
-          <w:sz w:val="24"/>
-          <w:szCs w:val="24"/>
+          <w:rFonts w:ascii="Courier New" w:hAnsi="Courier New" w:cs="Courier New"/>
         </w:rPr>
         <w:t>ceph -s \</w:t>
       </w:r>
@@ -2787,10 +2308,7 @@
       </w:pPr>
       <w:r>
         <w:rPr>
-          <w:rFonts w:ascii="Courier New" w:hAnsi="Courier New" w:eastAsia="Aptos" w:cs="Courier New" w:eastAsiaTheme="minorHAnsi"/>
-          <w:kern w:val="2"/>
-          <w:sz w:val="24"/>
-          <w:szCs w:val="24"/>
+          <w:rFonts w:ascii="Courier New" w:hAnsi="Courier New" w:cs="Courier New"/>
         </w:rPr>
         <w:t xml:space="preserve">  &gt; "$EVIDENCE/40-after-canary-ceph-s.txt"</w:t>
       </w:r>
@@ -2812,10 +2330,7 @@
       </w:pPr>
       <w:r>
         <w:rPr>
-          <w:rFonts w:ascii="Aptos" w:hAnsi="Aptos" w:eastAsia="Aptos" w:cs="Courier New" w:eastAsiaTheme="minorHAnsi"/>
-          <w:kern w:val="2"/>
-          <w:sz w:val="24"/>
-          <w:szCs w:val="24"/>
+          <w:rFonts w:ascii="Aptos" w:hAnsi="Aptos" w:cs="Courier New"/>
         </w:rPr>
         <w:t>Lấy toàn bộ PG trên X</w:t>
       </w:r>
@@ -2829,10 +2344,7 @@
       </w:pPr>
       <w:r>
         <w:rPr>
-          <w:rFonts w:ascii="Courier New" w:hAnsi="Courier New" w:eastAsia="Aptos" w:cs="Courier New" w:eastAsiaTheme="minorHAnsi"/>
-          <w:kern w:val="2"/>
-          <w:sz w:val="24"/>
-          <w:szCs w:val="24"/>
+          <w:rFonts w:ascii="Courier New" w:hAnsi="Courier New" w:cs="Courier New"/>
         </w:rPr>
         <w:t>ceph pg ls-by-osd $X -f json \</w:t>
       </w:r>
@@ -2846,10 +2358,7 @@
       </w:pPr>
       <w:r>
         <w:rPr>
-          <w:rFonts w:ascii="Courier New" w:hAnsi="Courier New" w:eastAsia="Aptos" w:cs="Courier New" w:eastAsiaTheme="minorHAnsi"/>
-          <w:kern w:val="2"/>
-          <w:sz w:val="24"/>
-          <w:szCs w:val="24"/>
+          <w:rFonts w:ascii="Courier New" w:hAnsi="Courier New" w:cs="Courier New"/>
         </w:rPr>
         <w:t xml:space="preserve">  | jq -r '.pg_stats[].pgid' \</w:t>
       </w:r>
@@ -2863,10 +2372,7 @@
       </w:pPr>
       <w:r>
         <w:rPr>
-          <w:rFonts w:ascii="Courier New" w:hAnsi="Courier New" w:eastAsia="Aptos" w:cs="Courier New" w:eastAsiaTheme="minorHAnsi"/>
-          <w:kern w:val="2"/>
-          <w:sz w:val="24"/>
-          <w:szCs w:val="24"/>
+          <w:rFonts w:ascii="Courier New" w:hAnsi="Courier New" w:cs="Courier New"/>
         </w:rPr>
         <w:t xml:space="preserve">  &gt; "$EVIDENCE/41-X-all-pgs-to-drain.txt"</w:t>
       </w:r>
@@ -2888,10 +2394,7 @@
       </w:pPr>
       <w:r>
         <w:rPr>
-          <w:rFonts w:ascii="Courier New" w:hAnsi="Courier New" w:eastAsia="Aptos" w:cs="Courier New" w:eastAsiaTheme="minorHAnsi"/>
-          <w:kern w:val="2"/>
-          <w:sz w:val="24"/>
-          <w:szCs w:val="24"/>
+          <w:rFonts w:ascii="Courier New" w:hAnsi="Courier New" w:cs="Courier New"/>
         </w:rPr>
         <w:t>wc -l "$EVIDENCE/41-X-all-pgs-to-drain.txt"</w:t>
       </w:r>
@@ -2913,10 +2416,7 @@
       </w:pPr>
       <w:r>
         <w:rPr>
-          <w:rFonts w:ascii="Aptos" w:hAnsi="Aptos" w:eastAsia="Aptos" w:cs="Courier New" w:eastAsiaTheme="minorHAnsi"/>
-          <w:kern w:val="2"/>
-          <w:sz w:val="24"/>
-          <w:szCs w:val="24"/>
+          <w:rFonts w:ascii="Aptos" w:hAnsi="Aptos" w:cs="Courier New"/>
         </w:rPr>
         <w:t xml:space="preserve">giờ drain từng pg theo batch 1 </w:t>
       </w:r>
@@ -2930,10 +2430,7 @@
       </w:pPr>
       <w:r>
         <w:rPr>
-          <w:rFonts w:ascii="Courier New" w:hAnsi="Courier New" w:eastAsia="Aptos" w:cs="Courier New" w:eastAsiaTheme="minorHAnsi"/>
-          <w:kern w:val="2"/>
-          <w:sz w:val="24"/>
-          <w:szCs w:val="24"/>
+          <w:rFonts w:ascii="Courier New" w:hAnsi="Courier New" w:cs="Courier New"/>
         </w:rPr>
         <w:t>for BATCH in "$EVIDENCE"/batch-*; do</w:t>
       </w:r>
@@ -2947,10 +2444,7 @@
       </w:pPr>
       <w:r>
         <w:rPr>
-          <w:rFonts w:ascii="Courier New" w:hAnsi="Courier New" w:eastAsia="Aptos" w:cs="Courier New" w:eastAsiaTheme="minorHAnsi"/>
-          <w:kern w:val="2"/>
-          <w:sz w:val="24"/>
-          <w:szCs w:val="24"/>
+          <w:rFonts w:ascii="Courier New" w:hAnsi="Courier New" w:cs="Courier New"/>
         </w:rPr>
         <w:t xml:space="preserve">    echo</w:t>
       </w:r>
@@ -2964,10 +2458,7 @@
       </w:pPr>
       <w:r>
         <w:rPr>
-          <w:rFonts w:ascii="Courier New" w:hAnsi="Courier New" w:eastAsia="Aptos" w:cs="Courier New" w:eastAsiaTheme="minorHAnsi"/>
-          <w:kern w:val="2"/>
-          <w:sz w:val="24"/>
-          <w:szCs w:val="24"/>
+          <w:rFonts w:ascii="Courier New" w:hAnsi="Courier New" w:cs="Courier New"/>
         </w:rPr>
         <w:t xml:space="preserve">    echo "========================================="</w:t>
       </w:r>
@@ -2981,10 +2472,7 @@
       </w:pPr>
       <w:r>
         <w:rPr>
-          <w:rFonts w:ascii="Courier New" w:hAnsi="Courier New" w:eastAsia="Aptos" w:cs="Courier New" w:eastAsiaTheme="minorHAnsi"/>
-          <w:kern w:val="2"/>
-          <w:sz w:val="24"/>
-          <w:szCs w:val="24"/>
+          <w:rFonts w:ascii="Courier New" w:hAnsi="Courier New" w:cs="Courier New"/>
         </w:rPr>
         <w:t xml:space="preserve">    echo "Running: $BATCH"</w:t>
       </w:r>
@@ -2998,10 +2486,7 @@
       </w:pPr>
       <w:r>
         <w:rPr>
-          <w:rFonts w:ascii="Courier New" w:hAnsi="Courier New" w:eastAsia="Aptos" w:cs="Courier New" w:eastAsiaTheme="minorHAnsi"/>
-          <w:kern w:val="2"/>
-          <w:sz w:val="24"/>
-          <w:szCs w:val="24"/>
+          <w:rFonts w:ascii="Courier New" w:hAnsi="Courier New" w:cs="Courier New"/>
         </w:rPr>
         <w:t xml:space="preserve">    echo "========================================="</w:t>
       </w:r>
@@ -3023,10 +2508,7 @@
       </w:pPr>
       <w:r>
         <w:rPr>
-          <w:rFonts w:ascii="Courier New" w:hAnsi="Courier New" w:eastAsia="Aptos" w:cs="Courier New" w:eastAsiaTheme="minorHAnsi"/>
-          <w:kern w:val="2"/>
-          <w:sz w:val="24"/>
-          <w:szCs w:val="24"/>
+          <w:rFonts w:ascii="Courier New" w:hAnsi="Courier New" w:cs="Courier New"/>
         </w:rPr>
         <w:t xml:space="preserve">    while IFS= read -r PG; do</w:t>
       </w:r>
@@ -3040,10 +2522,7 @@
       </w:pPr>
       <w:r>
         <w:rPr>
-          <w:rFonts w:ascii="Courier New" w:hAnsi="Courier New" w:eastAsia="Aptos" w:cs="Courier New" w:eastAsiaTheme="minorHAnsi"/>
-          <w:kern w:val="2"/>
-          <w:sz w:val="24"/>
-          <w:szCs w:val="24"/>
+          <w:rFonts w:ascii="Courier New" w:hAnsi="Courier New" w:cs="Courier New"/>
         </w:rPr>
         <w:t xml:space="preserve">        [ -z "$PG" ] &amp;&amp; continue</w:t>
       </w:r>
@@ -3065,10 +2544,7 @@
       </w:pPr>
       <w:r>
         <w:rPr>
-          <w:rFonts w:ascii="Courier New" w:hAnsi="Courier New" w:eastAsia="Aptos" w:cs="Courier New" w:eastAsiaTheme="minorHAnsi"/>
-          <w:kern w:val="2"/>
-          <w:sz w:val="24"/>
-          <w:szCs w:val="24"/>
+          <w:rFonts w:ascii="Courier New" w:hAnsi="Courier New" w:cs="Courier New"/>
         </w:rPr>
         <w:t xml:space="preserve">        echo "UPMAP $PG : osd.$X -&gt; osd.$S"</w:t>
       </w:r>
@@ -3090,10 +2566,7 @@
       </w:pPr>
       <w:r>
         <w:rPr>
-          <w:rFonts w:ascii="Courier New" w:hAnsi="Courier New" w:eastAsia="Aptos" w:cs="Courier New" w:eastAsiaTheme="minorHAnsi"/>
-          <w:kern w:val="2"/>
-          <w:sz w:val="24"/>
-          <w:szCs w:val="24"/>
+          <w:rFonts w:ascii="Courier New" w:hAnsi="Courier New" w:cs="Courier New"/>
         </w:rPr>
         <w:t xml:space="preserve">        ceph osd pg-upmap-items "$PG" "$X" "$S" &lt;/dev/null || exit 1</w:t>
       </w:r>
@@ -3107,10 +2580,7 @@
       </w:pPr>
       <w:r>
         <w:rPr>
-          <w:rFonts w:ascii="Courier New" w:hAnsi="Courier New" w:eastAsia="Aptos" w:cs="Courier New" w:eastAsiaTheme="minorHAnsi"/>
-          <w:kern w:val="2"/>
-          <w:sz w:val="24"/>
-          <w:szCs w:val="24"/>
+          <w:rFonts w:ascii="Courier New" w:hAnsi="Courier New" w:cs="Courier New"/>
         </w:rPr>
         <w:t xml:space="preserve">    done &lt; "$BATCH"</w:t>
       </w:r>
@@ -3132,10 +2602,7 @@
       </w:pPr>
       <w:r>
         <w:rPr>
-          <w:rFonts w:ascii="Courier New" w:hAnsi="Courier New" w:eastAsia="Aptos" w:cs="Courier New" w:eastAsiaTheme="minorHAnsi"/>
-          <w:kern w:val="2"/>
-          <w:sz w:val="24"/>
-          <w:szCs w:val="24"/>
+          <w:rFonts w:ascii="Courier New" w:hAnsi="Courier New" w:cs="Courier New"/>
         </w:rPr>
         <w:t xml:space="preserve">    echo "Waiting for all PGs to become active+clean..."</w:t>
       </w:r>
@@ -3157,10 +2624,7 @@
       </w:pPr>
       <w:r>
         <w:rPr>
-          <w:rFonts w:ascii="Courier New" w:hAnsi="Courier New" w:eastAsia="Aptos" w:cs="Courier New" w:eastAsiaTheme="minorHAnsi"/>
-          <w:kern w:val="2"/>
-          <w:sz w:val="24"/>
-          <w:szCs w:val="24"/>
+          <w:rFonts w:ascii="Courier New" w:hAnsi="Courier New" w:cs="Courier New"/>
         </w:rPr>
         <w:t xml:space="preserve">    while :; do</w:t>
       </w:r>
@@ -3174,10 +2638,7 @@
       </w:pPr>
       <w:r>
         <w:rPr>
-          <w:rFonts w:ascii="Courier New" w:hAnsi="Courier New" w:eastAsia="Aptos" w:cs="Courier New" w:eastAsiaTheme="minorHAnsi"/>
-          <w:kern w:val="2"/>
-          <w:sz w:val="24"/>
-          <w:szCs w:val="24"/>
+          <w:rFonts w:ascii="Courier New" w:hAnsi="Courier New" w:cs="Courier New"/>
         </w:rPr>
         <w:t xml:space="preserve">        BAD=$(</w:t>
       </w:r>
@@ -3191,10 +2652,7 @@
       </w:pPr>
       <w:r>
         <w:rPr>
-          <w:rFonts w:ascii="Courier New" w:hAnsi="Courier New" w:eastAsia="Aptos" w:cs="Courier New" w:eastAsiaTheme="minorHAnsi"/>
-          <w:kern w:val="2"/>
-          <w:sz w:val="24"/>
-          <w:szCs w:val="24"/>
+          <w:rFonts w:ascii="Courier New" w:hAnsi="Courier New" w:cs="Courier New"/>
         </w:rPr>
         <w:t xml:space="preserve">            ceph pg dump pgs_brief -f json 2&gt;/dev/null \</w:t>
       </w:r>
@@ -3207,13 +2665,10 @@
         </w:rPr>
       </w:pPr>
       <w:r>
+        <w:rPr>
+          <w:rFonts w:ascii="Courier New" w:hAnsi="Courier New" w:cs="Courier New"/>
+        </w:rPr>
         <w:lastRenderedPageBreak/>
-        <w:rPr>
-          <w:rFonts w:ascii="Courier New" w:hAnsi="Courier New" w:eastAsia="Aptos" w:cs="Courier New" w:eastAsiaTheme="minorHAnsi"/>
-          <w:kern w:val="2"/>
-          <w:sz w:val="24"/>
-          <w:szCs w:val="24"/>
-        </w:rPr>
         <w:t xml:space="preserve">            | jq '[.pg_stats[] | select(.state != "active+clean")] | length'</w:t>
       </w:r>
     </w:p>
@@ -3226,10 +2681,7 @@
       </w:pPr>
       <w:r>
         <w:rPr>
-          <w:rFonts w:ascii="Courier New" w:hAnsi="Courier New" w:eastAsia="Aptos" w:cs="Courier New" w:eastAsiaTheme="minorHAnsi"/>
-          <w:kern w:val="2"/>
-          <w:sz w:val="24"/>
-          <w:szCs w:val="24"/>
+          <w:rFonts w:ascii="Courier New" w:hAnsi="Courier New" w:cs="Courier New"/>
         </w:rPr>
         <w:t xml:space="preserve">        )</w:t>
       </w:r>
@@ -3251,10 +2703,7 @@
       </w:pPr>
       <w:r>
         <w:rPr>
-          <w:rFonts w:ascii="Courier New" w:hAnsi="Courier New" w:eastAsia="Aptos" w:cs="Courier New" w:eastAsiaTheme="minorHAnsi"/>
-          <w:kern w:val="2"/>
-          <w:sz w:val="24"/>
-          <w:szCs w:val="24"/>
+          <w:rFonts w:ascii="Courier New" w:hAnsi="Courier New" w:cs="Courier New"/>
         </w:rPr>
         <w:t xml:space="preserve">        echo "PG not active+clean: $BAD"</w:t>
       </w:r>
@@ -3276,10 +2725,7 @@
       </w:pPr>
       <w:r>
         <w:rPr>
-          <w:rFonts w:ascii="Courier New" w:hAnsi="Courier New" w:eastAsia="Aptos" w:cs="Courier New" w:eastAsiaTheme="minorHAnsi"/>
-          <w:kern w:val="2"/>
-          <w:sz w:val="24"/>
-          <w:szCs w:val="24"/>
+          <w:rFonts w:ascii="Courier New" w:hAnsi="Courier New" w:cs="Courier New"/>
         </w:rPr>
         <w:t xml:space="preserve">        if [ "$BAD" -eq 0 ]; then</w:t>
       </w:r>
@@ -3293,10 +2739,7 @@
       </w:pPr>
       <w:r>
         <w:rPr>
-          <w:rFonts w:ascii="Courier New" w:hAnsi="Courier New" w:eastAsia="Aptos" w:cs="Courier New" w:eastAsiaTheme="minorHAnsi"/>
-          <w:kern w:val="2"/>
-          <w:sz w:val="24"/>
-          <w:szCs w:val="24"/>
+          <w:rFonts w:ascii="Courier New" w:hAnsi="Courier New" w:cs="Courier New"/>
         </w:rPr>
         <w:t xml:space="preserve">            echo "Batch converged."</w:t>
       </w:r>
@@ -3310,10 +2753,7 @@
       </w:pPr>
       <w:r>
         <w:rPr>
-          <w:rFonts w:ascii="Courier New" w:hAnsi="Courier New" w:eastAsia="Aptos" w:cs="Courier New" w:eastAsiaTheme="minorHAnsi"/>
-          <w:kern w:val="2"/>
-          <w:sz w:val="24"/>
-          <w:szCs w:val="24"/>
+          <w:rFonts w:ascii="Courier New" w:hAnsi="Courier New" w:cs="Courier New"/>
         </w:rPr>
         <w:t xml:space="preserve">            break</w:t>
       </w:r>
@@ -3327,10 +2767,7 @@
       </w:pPr>
       <w:r>
         <w:rPr>
-          <w:rFonts w:ascii="Courier New" w:hAnsi="Courier New" w:eastAsia="Aptos" w:cs="Courier New" w:eastAsiaTheme="minorHAnsi"/>
-          <w:kern w:val="2"/>
-          <w:sz w:val="24"/>
-          <w:szCs w:val="24"/>
+          <w:rFonts w:ascii="Courier New" w:hAnsi="Courier New" w:cs="Courier New"/>
         </w:rPr>
         <w:t xml:space="preserve">        fi</w:t>
       </w:r>
@@ -3352,10 +2789,7 @@
       </w:pPr>
       <w:r>
         <w:rPr>
-          <w:rFonts w:ascii="Courier New" w:hAnsi="Courier New" w:eastAsia="Aptos" w:cs="Courier New" w:eastAsiaTheme="minorHAnsi"/>
-          <w:kern w:val="2"/>
-          <w:sz w:val="24"/>
-          <w:szCs w:val="24"/>
+          <w:rFonts w:ascii="Courier New" w:hAnsi="Courier New" w:cs="Courier New"/>
         </w:rPr>
         <w:t xml:space="preserve">        sleep 5</w:t>
       </w:r>
@@ -3369,10 +2803,7 @@
       </w:pPr>
       <w:r>
         <w:rPr>
-          <w:rFonts w:ascii="Courier New" w:hAnsi="Courier New" w:eastAsia="Aptos" w:cs="Courier New" w:eastAsiaTheme="minorHAnsi"/>
-          <w:kern w:val="2"/>
-          <w:sz w:val="24"/>
-          <w:szCs w:val="24"/>
+          <w:rFonts w:ascii="Courier New" w:hAnsi="Courier New" w:cs="Courier New"/>
         </w:rPr>
         <w:t xml:space="preserve">    done</w:t>
       </w:r>
@@ -3386,10 +2817,7 @@
       </w:pPr>
       <w:r>
         <w:rPr>
-          <w:rFonts w:ascii="Courier New" w:hAnsi="Courier New" w:eastAsia="Aptos" w:cs="Courier New" w:eastAsiaTheme="minorHAnsi"/>
-          <w:kern w:val="2"/>
-          <w:sz w:val="24"/>
-          <w:szCs w:val="24"/>
+          <w:rFonts w:ascii="Courier New" w:hAnsi="Courier New" w:cs="Courier New"/>
         </w:rPr>
         <w:t>done</w:t>
       </w:r>
@@ -3401,24 +2829,20 @@
           <w:rFonts w:ascii="Courier New" w:hAnsi="Courier New" w:cs="Courier New"/>
         </w:rPr>
       </w:pPr>
-      <w:r>
-        <w:lastRenderedPageBreak/>
-        <w:rPr>
-          <w:rFonts w:ascii="Courier New" w:hAnsi="Courier New" w:cs="Courier New"/>
-        </w:rPr>
-      </w:r>
-    </w:p>
-    <w:p>
-      <w:pPr>
-        <w:spacing w:after="0"/>
-        <w:rPr>
-          <w:rFonts w:ascii="Aptos" w:hAnsi="Aptos" w:cs="Courier New"/>
-        </w:rPr>
-      </w:pPr>
-      <w:r>
-        <w:lastRenderedPageBreak/>
+    </w:p>
+    <w:p>
+      <w:pPr>
+        <w:spacing w:after="0"/>
+        <w:rPr>
+          <w:rFonts w:ascii="Aptos" w:hAnsi="Aptos" w:cs="Courier New"/>
+        </w:rPr>
+      </w:pPr>
+      <w:r>
+        <w:rPr>
+          <w:noProof/>
+        </w:rPr>
         <w:drawing>
-          <wp:anchor distT="0" distB="0" distL="114300" distR="114300" simplePos="0" relativeHeight="251658240" behindDoc="0" locked="0" layoutInCell="1" allowOverlap="1">
+          <wp:anchor distT="0" distB="0" distL="114300" distR="114300" simplePos="0" relativeHeight="251655168" behindDoc="0" locked="0" layoutInCell="1" allowOverlap="1" wp14:anchorId="481A2976" wp14:editId="2EB56265">
             <wp:simplePos x="0" y="0"/>
             <wp:positionH relativeFrom="column">
               <wp:posOffset>0</wp:posOffset>
@@ -3441,7 +2865,7 @@
                     <pic:cNvPicPr/>
                   </pic:nvPicPr>
                   <pic:blipFill>
-                    <a:blip r:embed="rId27"/>
+                    <a:blip r:embed="rId10"/>
                     <a:stretch>
                       <a:fillRect/>
                     </a:stretch>
@@ -3463,10 +2887,7 @@
       </w:r>
       <w:r>
         <w:rPr>
-          <w:rFonts w:ascii="Aptos" w:hAnsi="Aptos" w:eastAsia="Aptos" w:cs="Courier New" w:eastAsiaTheme="minorHAnsi"/>
-          <w:kern w:val="2"/>
-          <w:sz w:val="24"/>
-          <w:szCs w:val="24"/>
+          <w:rFonts w:ascii="Aptos" w:hAnsi="Aptos" w:cs="Courier New"/>
         </w:rPr>
         <w:t>đã hết pg sau khi drain và đã ok-to-stop</w:t>
       </w:r>
@@ -3500,43 +2921,15 @@
       </w:pPr>
       <w:r>
         <w:rPr>
-          <w:rFonts w:ascii="Aptos" w:hAnsi="Aptos" w:eastAsia="Aptos" w:cs="Courier New" w:eastAsiaTheme="minorHAnsi"/>
+          <w:rFonts w:ascii="Aptos" w:hAnsi="Aptos" w:cs="Courier New"/>
           <w:b/>
           <w:bCs/>
-          <w:kern w:val="2"/>
-          <w:sz w:val="24"/>
-          <w:szCs w:val="24"/>
-        </w:rPr>
-        <w:t xml:space="preserve">A5: nâng đúng </w:t>
-      </w:r>
-      <w:r>
-        <w:rPr>
-          <w:rFonts w:ascii="Aptos" w:hAnsi="Aptos" w:eastAsia="Aptos" w:cs="Courier New" w:eastAsiaTheme="minorHAnsi"/>
-          <w:b/>
-          <w:bCs/>
-          <w:kern w:val="2"/>
-          <w:sz w:val="24"/>
-          <w:szCs w:val="24"/>
-        </w:rPr>
-        <w:t>osd.$</w:t>
-      </w:r>
-      <w:r>
-        <w:rPr>
-          <w:rFonts w:ascii="Aptos" w:hAnsi="Aptos" w:eastAsia="Aptos" w:cs="Courier New" w:eastAsiaTheme="minorHAnsi"/>
-          <w:b/>
-          <w:bCs/>
-          <w:kern w:val="2"/>
-          <w:sz w:val="24"/>
-          <w:szCs w:val="24"/>
-        </w:rPr>
-        <w:t>X lên 16.2.15</w:t>
-      </w:r>
-      <w:r>
-        <w:rPr>
-          <w:rFonts w:ascii="Aptos" w:hAnsi="Aptos" w:eastAsia="Aptos" w:cs="Courier New" w:eastAsiaTheme="minorHAnsi"/>
-          <w:kern w:val="2"/>
-          <w:sz w:val="24"/>
-          <w:szCs w:val="24"/>
+        </w:rPr>
+        <w:t>A5: nâng đúng osd.$X lên 16.2.15</w:t>
+      </w:r>
+      <w:r>
+        <w:rPr>
+          <w:rFonts w:ascii="Aptos" w:hAnsi="Aptos" w:cs="Courier New"/>
         </w:rPr>
         <w:t>, giữ toàn bộ PG ở S/Y/Z.</w:t>
       </w:r>
@@ -3558,10 +2951,7 @@
       </w:pPr>
       <w:r>
         <w:rPr>
-          <w:rFonts w:ascii="Aptos" w:hAnsi="Aptos" w:eastAsia="Aptos" w:cs="Courier New" w:eastAsiaTheme="minorHAnsi"/>
-          <w:kern w:val="2"/>
-          <w:sz w:val="24"/>
-          <w:szCs w:val="24"/>
+          <w:rFonts w:ascii="Aptos" w:hAnsi="Aptos" w:cs="Courier New"/>
         </w:rPr>
         <w:t>Ckpt cuối trước update:</w:t>
       </w:r>
@@ -3575,10 +2965,7 @@
       </w:pPr>
       <w:r>
         <w:rPr>
-          <w:rFonts w:ascii="Courier New" w:hAnsi="Courier New" w:eastAsia="Aptos" w:cs="Courier New" w:eastAsiaTheme="minorHAnsi"/>
-          <w:kern w:val="2"/>
-          <w:sz w:val="24"/>
-          <w:szCs w:val="24"/>
+          <w:rFonts w:ascii="Courier New" w:hAnsi="Courier New" w:cs="Courier New"/>
         </w:rPr>
         <w:t>ceph -s &gt; "$EVIDENCE/54-dr-ready-ceph-s.txt"</w:t>
       </w:r>
@@ -3592,10 +2979,7 @@
       </w:pPr>
       <w:r>
         <w:rPr>
-          <w:rFonts w:ascii="Courier New" w:hAnsi="Courier New" w:eastAsia="Aptos" w:cs="Courier New" w:eastAsiaTheme="minorHAnsi"/>
-          <w:kern w:val="2"/>
-          <w:sz w:val="24"/>
-          <w:szCs w:val="24"/>
+          <w:rFonts w:ascii="Courier New" w:hAnsi="Courier New" w:cs="Courier New"/>
         </w:rPr>
         <w:t>ceph health detail &gt; "$EVIDENCE/55-dr-ready-health.txt"</w:t>
       </w:r>
@@ -3609,10 +2993,7 @@
       </w:pPr>
       <w:r>
         <w:rPr>
-          <w:rFonts w:ascii="Courier New" w:hAnsi="Courier New" w:eastAsia="Aptos" w:cs="Courier New" w:eastAsiaTheme="minorHAnsi"/>
-          <w:kern w:val="2"/>
-          <w:sz w:val="24"/>
-          <w:szCs w:val="24"/>
+          <w:rFonts w:ascii="Courier New" w:hAnsi="Courier New" w:cs="Courier New"/>
         </w:rPr>
         <w:t>ceph pg ls-by-osd $X &gt; "$EVIDENCE/56-X-pgs-before-upgrade.txt"</w:t>
       </w:r>
@@ -3626,10 +3007,7 @@
       </w:pPr>
       <w:r>
         <w:rPr>
-          <w:rFonts w:ascii="Courier New" w:hAnsi="Courier New" w:eastAsia="Aptos" w:cs="Courier New" w:eastAsiaTheme="minorHAnsi"/>
-          <w:kern w:val="2"/>
-          <w:sz w:val="24"/>
-          <w:szCs w:val="24"/>
+          <w:rFonts w:ascii="Courier New" w:hAnsi="Courier New" w:cs="Courier New"/>
         </w:rPr>
         <w:t>ceph osd ok-to-stop $X \</w:t>
       </w:r>
@@ -3643,10 +3021,7 @@
       </w:pPr>
       <w:r>
         <w:rPr>
-          <w:rFonts w:ascii="Courier New" w:hAnsi="Courier New" w:eastAsia="Aptos" w:cs="Courier New" w:eastAsiaTheme="minorHAnsi"/>
-          <w:kern w:val="2"/>
-          <w:sz w:val="24"/>
-          <w:szCs w:val="24"/>
+          <w:rFonts w:ascii="Courier New" w:hAnsi="Courier New" w:cs="Courier New"/>
         </w:rPr>
         <w:t xml:space="preserve">  &gt; "$EVIDENCE/57-X-ok-to-stop.txt" 2&gt;&amp;1</w:t>
       </w:r>
@@ -3660,10 +3035,7 @@
       </w:pPr>
       <w:r>
         <w:rPr>
-          <w:rFonts w:ascii="Courier New" w:hAnsi="Courier New" w:eastAsia="Aptos" w:cs="Courier New" w:eastAsiaTheme="minorHAnsi"/>
-          <w:kern w:val="2"/>
-          <w:sz w:val="24"/>
-          <w:szCs w:val="24"/>
+          <w:rFonts w:ascii="Courier New" w:hAnsi="Courier New" w:cs="Courier New"/>
         </w:rPr>
         <w:t>ceph versions &gt; "$EVIDENCE/58-versions-before-upgrade.txt"</w:t>
       </w:r>
@@ -3685,10 +3057,7 @@
       </w:pPr>
       <w:r>
         <w:rPr>
-          <w:rFonts w:ascii="Aptos" w:hAnsi="Aptos" w:eastAsia="Aptos" w:cs="Courier New" w:eastAsiaTheme="minorHAnsi"/>
-          <w:kern w:val="2"/>
-          <w:sz w:val="24"/>
-          <w:szCs w:val="24"/>
+          <w:rFonts w:ascii="Aptos" w:hAnsi="Aptos" w:cs="Courier New"/>
         </w:rPr>
         <w:t>set noout</w:t>
       </w:r>
@@ -3702,10 +3071,7 @@
       </w:pPr>
       <w:r>
         <w:rPr>
-          <w:rFonts w:ascii="Courier New" w:hAnsi="Courier New" w:eastAsia="Aptos" w:cs="Courier New" w:eastAsiaTheme="minorHAnsi"/>
-          <w:kern w:val="2"/>
-          <w:sz w:val="24"/>
-          <w:szCs w:val="24"/>
+          <w:rFonts w:ascii="Courier New" w:hAnsi="Courier New" w:cs="Courier New"/>
         </w:rPr>
         <w:t>ceph osd set-group noout osd.$X</w:t>
       </w:r>
@@ -3735,10 +3101,7 @@
       </w:pPr>
       <w:r>
         <w:rPr>
-          <w:rFonts w:ascii="Aptos" w:hAnsi="Aptos" w:eastAsia="Aptos" w:cs="Courier New" w:eastAsiaTheme="minorHAnsi"/>
-          <w:kern w:val="2"/>
-          <w:sz w:val="24"/>
-          <w:szCs w:val="24"/>
+          <w:rFonts w:ascii="Aptos" w:hAnsi="Aptos" w:cs="Courier New"/>
         </w:rPr>
         <w:t>kiểm tra daemon hiện tại</w:t>
       </w:r>
@@ -3752,10 +3115,7 @@
       </w:pPr>
       <w:r>
         <w:rPr>
-          <w:rFonts w:ascii="Courier New" w:hAnsi="Courier New" w:eastAsia="Aptos" w:cs="Courier New" w:eastAsiaTheme="minorHAnsi"/>
-          <w:kern w:val="2"/>
-          <w:sz w:val="24"/>
-          <w:szCs w:val="24"/>
+          <w:rFonts w:ascii="Courier New" w:hAnsi="Courier New" w:cs="Courier New"/>
         </w:rPr>
         <w:t>ceph orch ps --daemon_type osd --format yaml | less</w:t>
       </w:r>
@@ -3785,10 +3145,7 @@
       </w:pPr>
       <w:r>
         <w:rPr>
-          <w:rFonts w:ascii="Courier New" w:hAnsi="Courier New" w:eastAsia="Aptos" w:cs="Courier New" w:eastAsiaTheme="minorHAnsi"/>
-          <w:kern w:val="2"/>
-          <w:sz w:val="24"/>
-          <w:szCs w:val="24"/>
+          <w:rFonts w:ascii="Courier New" w:hAnsi="Courier New" w:cs="Courier New"/>
         </w:rPr>
         <w:t>ceph orch ps --daemon_type osd --format yaml \</w:t>
       </w:r>
@@ -3802,10 +3159,7 @@
       </w:pPr>
       <w:r>
         <w:rPr>
-          <w:rFonts w:ascii="Courier New" w:hAnsi="Courier New" w:eastAsia="Aptos" w:cs="Courier New" w:eastAsiaTheme="minorHAnsi"/>
-          <w:kern w:val="2"/>
-          <w:sz w:val="24"/>
-          <w:szCs w:val="24"/>
+          <w:rFonts w:ascii="Courier New" w:hAnsi="Courier New" w:cs="Courier New"/>
         </w:rPr>
         <w:t xml:space="preserve">  &gt; "$EVIDENCE/60-osd-containers-before-X-upgrade.yaml"</w:t>
       </w:r>
@@ -3827,10 +3181,7 @@
       </w:pPr>
       <w:r>
         <w:rPr>
-          <w:rFonts w:ascii="Courier New" w:hAnsi="Courier New" w:eastAsia="Aptos" w:cs="Courier New" w:eastAsiaTheme="minorHAnsi"/>
-          <w:kern w:val="2"/>
-          <w:sz w:val="24"/>
-          <w:szCs w:val="24"/>
+          <w:rFonts w:ascii="Courier New" w:hAnsi="Courier New" w:cs="Courier New"/>
         </w:rPr>
         <w:t>ceph versions \</w:t>
       </w:r>
@@ -3844,10 +3195,7 @@
       </w:pPr>
       <w:r>
         <w:rPr>
-          <w:rFonts w:ascii="Courier New" w:hAnsi="Courier New" w:eastAsia="Aptos" w:cs="Courier New" w:eastAsiaTheme="minorHAnsi"/>
-          <w:kern w:val="2"/>
-          <w:sz w:val="24"/>
-          <w:szCs w:val="24"/>
+          <w:rFonts w:ascii="Courier New" w:hAnsi="Courier New" w:cs="Courier New"/>
         </w:rPr>
         <w:t xml:space="preserve">  &gt; "$EVIDENCE/61-versions-before-X-upgrade.txt"</w:t>
       </w:r>
@@ -3869,10 +3217,7 @@
       </w:pPr>
       <w:r>
         <w:rPr>
-          <w:rFonts w:ascii="Courier New" w:hAnsi="Courier New" w:eastAsia="Aptos" w:cs="Courier New" w:eastAsiaTheme="minorHAnsi"/>
-          <w:kern w:val="2"/>
-          <w:sz w:val="24"/>
-          <w:szCs w:val="24"/>
+          <w:rFonts w:ascii="Courier New" w:hAnsi="Courier New" w:cs="Courier New"/>
         </w:rPr>
         <w:t>ceph pg ls-by-osd $X \</w:t>
       </w:r>
@@ -3886,10 +3231,7 @@
       </w:pPr>
       <w:r>
         <w:rPr>
-          <w:rFonts w:ascii="Courier New" w:hAnsi="Courier New" w:eastAsia="Aptos" w:cs="Courier New" w:eastAsiaTheme="minorHAnsi"/>
-          <w:kern w:val="2"/>
-          <w:sz w:val="24"/>
-          <w:szCs w:val="24"/>
+          <w:rFonts w:ascii="Courier New" w:hAnsi="Courier New" w:cs="Courier New"/>
         </w:rPr>
         <w:t xml:space="preserve">  &gt; "$EVIDENCE/62-X-pgs-final-before-upgrade.txt"</w:t>
       </w:r>
@@ -3911,10 +3253,7 @@
       </w:pPr>
       <w:r>
         <w:rPr>
-          <w:rFonts w:ascii="Aptos" w:hAnsi="Aptos" w:eastAsia="Aptos" w:cs="Courier New" w:eastAsiaTheme="minorHAnsi"/>
-          <w:kern w:val="2"/>
-          <w:sz w:val="24"/>
-          <w:szCs w:val="24"/>
+          <w:rFonts w:ascii="Aptos" w:hAnsi="Aptos" w:cs="Courier New"/>
         </w:rPr>
         <w:t>Lấy public image:</w:t>
       </w:r>
@@ -3928,11 +3267,9 @@
       </w:pPr>
       <w:r>
         <w:rPr>
-          <w:rFonts w:ascii="Courier New" w:hAnsi="Courier New" w:eastAsia="Aptos" w:cs="Courier New" w:eastAsiaTheme="minorHAnsi"/>
-          <w:kern w:val="2"/>
-          <w:sz w:val="24"/>
-          <w:szCs w:val="24"/>
-        </w:rPr>
+          <w:rFonts w:ascii="Courier New" w:hAnsi="Courier New" w:cs="Courier New"/>
+        </w:rPr>
+        <w:lastRenderedPageBreak/>
         <w:t>export TARGET_IMAGE='quay.io/ceph/ceph:v16.2.15'</w:t>
       </w:r>
     </w:p>
@@ -3945,10 +3282,7 @@
       </w:pPr>
       <w:r>
         <w:rPr>
-          <w:rFonts w:ascii="Courier New" w:hAnsi="Courier New" w:eastAsia="Aptos" w:cs="Courier New" w:eastAsiaTheme="minorHAnsi"/>
-          <w:kern w:val="2"/>
-          <w:sz w:val="24"/>
-          <w:szCs w:val="24"/>
+          <w:rFonts w:ascii="Courier New" w:hAnsi="Courier New" w:cs="Courier New"/>
         </w:rPr>
         <w:t>echo "$TARGET_IMAGE"</w:t>
       </w:r>
@@ -3964,12 +3298,8 @@
         </w:rPr>
       </w:pPr>
       <w:r>
-        <w:lastRenderedPageBreak/>
-        <w:rPr>
-          <w:rFonts w:ascii="Aptos" w:hAnsi="Aptos" w:eastAsia="Aptos" w:cs="Courier New" w:eastAsiaTheme="minorHAnsi"/>
-          <w:kern w:val="2"/>
-          <w:sz w:val="24"/>
-          <w:szCs w:val="24"/>
+        <w:rPr>
+          <w:rFonts w:ascii="Aptos" w:hAnsi="Aptos" w:cs="Courier New"/>
         </w:rPr>
         <w:t xml:space="preserve">osd 1 nằm trên ceph-node2 nên là phải sang ceph node2 </w:t>
       </w:r>
@@ -4000,10 +3330,7 @@
       </w:pPr>
       <w:r>
         <w:rPr>
-          <w:rFonts w:ascii="Aptos" w:hAnsi="Aptos" w:eastAsia="Aptos" w:cs="Courier New" w:eastAsiaTheme="minorHAnsi"/>
-          <w:kern w:val="2"/>
-          <w:sz w:val="24"/>
-          <w:szCs w:val="24"/>
+          <w:rFonts w:ascii="Aptos" w:hAnsi="Aptos" w:cs="Courier New"/>
         </w:rPr>
         <w:t>pull public image</w:t>
       </w:r>
@@ -4017,10 +3344,7 @@
       </w:pPr>
       <w:r>
         <w:rPr>
-          <w:rFonts w:ascii="Courier New" w:hAnsi="Courier New" w:eastAsia="Aptos" w:cs="Courier New" w:eastAsiaTheme="minorHAnsi"/>
-          <w:kern w:val="2"/>
-          <w:sz w:val="24"/>
-          <w:szCs w:val="24"/>
+          <w:rFonts w:ascii="Courier New" w:hAnsi="Courier New" w:cs="Courier New"/>
         </w:rPr>
         <w:t>sudo docker pull quay.io/ceph/ceph:v16.2.15</w:t>
       </w:r>
@@ -4034,10 +3358,7 @@
       </w:pPr>
       <w:r>
         <w:rPr>
-          <w:rFonts w:ascii="Courier New" w:hAnsi="Courier New" w:eastAsia="Aptos" w:cs="Courier New" w:eastAsiaTheme="minorHAnsi"/>
-          <w:kern w:val="2"/>
-          <w:sz w:val="24"/>
-          <w:szCs w:val="24"/>
+          <w:rFonts w:ascii="Courier New" w:hAnsi="Courier New" w:cs="Courier New"/>
         </w:rPr>
         <w:t>ceph orch daemon redeploy osd.$X --image "$TARGET_IMAGE"</w:t>
       </w:r>
@@ -4051,10 +3372,7 @@
       </w:pPr>
       <w:r>
         <w:rPr>
-          <w:rFonts w:ascii="Aptos" w:hAnsi="Aptos" w:eastAsia="Aptos" w:cs="Courier New" w:eastAsiaTheme="minorHAnsi"/>
-          <w:kern w:val="2"/>
-          <w:sz w:val="24"/>
-          <w:szCs w:val="24"/>
+          <w:rFonts w:ascii="Aptos" w:hAnsi="Aptos" w:cs="Courier New"/>
         </w:rPr>
         <w:t>kiểm tra daemon</w:t>
       </w:r>
@@ -4067,8 +3385,11 @@
         </w:rPr>
       </w:pPr>
       <w:r>
+        <w:rPr>
+          <w:noProof/>
+        </w:rPr>
         <w:drawing>
-          <wp:anchor distT="0" distB="0" distL="114300" distR="114300" simplePos="0" relativeHeight="251658240" behindDoc="0" locked="0" layoutInCell="1" allowOverlap="1">
+          <wp:anchor distT="0" distB="0" distL="114300" distR="114300" simplePos="0" relativeHeight="251656192" behindDoc="0" locked="0" layoutInCell="1" allowOverlap="1" wp14:anchorId="7F8C7DF3" wp14:editId="4BC8DB7F">
             <wp:simplePos x="0" y="0"/>
             <wp:positionH relativeFrom="column">
               <wp:posOffset>544</wp:posOffset>
@@ -4091,7 +3412,7 @@
                     <pic:cNvPicPr/>
                   </pic:nvPicPr>
                   <pic:blipFill>
-                    <a:blip r:embed="rId28"/>
+                    <a:blip r:embed="rId11"/>
                     <a:stretch>
                       <a:fillRect/>
                     </a:stretch>
@@ -4112,8 +3433,11 @@
         </w:drawing>
       </w:r>
       <w:r>
+        <w:rPr>
+          <w:noProof/>
+        </w:rPr>
         <w:drawing>
-          <wp:anchor distT="0" distB="0" distL="114300" distR="114300" simplePos="0" relativeHeight="251658240" behindDoc="0" locked="0" layoutInCell="1" allowOverlap="1">
+          <wp:anchor distT="0" distB="0" distL="114300" distR="114300" simplePos="0" relativeHeight="251657216" behindDoc="0" locked="0" layoutInCell="1" allowOverlap="1" wp14:anchorId="739979AA" wp14:editId="61DD697D">
             <wp:simplePos x="0" y="0"/>
             <wp:positionH relativeFrom="column">
               <wp:posOffset>0</wp:posOffset>
@@ -4136,7 +3460,7 @@
                     <pic:cNvPicPr/>
                   </pic:nvPicPr>
                   <pic:blipFill>
-                    <a:blip r:embed="rId29"/>
+                    <a:blip r:embed="rId12"/>
                     <a:stretch>
                       <a:fillRect/>
                     </a:stretch>
@@ -4158,10 +3482,7 @@
       </w:r>
       <w:r>
         <w:rPr>
-          <w:rFonts w:ascii="Courier New" w:hAnsi="Courier New" w:eastAsia="Aptos" w:cs="Courier New" w:eastAsiaTheme="minorHAnsi"/>
-          <w:kern w:val="2"/>
-          <w:sz w:val="24"/>
-          <w:szCs w:val="24"/>
+          <w:rFonts w:ascii="Courier New" w:hAnsi="Courier New" w:cs="Courier New"/>
         </w:rPr>
         <w:t>ceph versions ceph osd metadata $X | grep -E '"ceph_version"|"hostname"' ceph orch ps --daemon_type osd --format yaml</w:t>
       </w:r>
@@ -4173,24 +3494,20 @@
           <w:rFonts w:ascii="Courier New" w:hAnsi="Courier New" w:cs="Courier New"/>
         </w:rPr>
       </w:pPr>
-      <w:r>
-        <w:lastRenderedPageBreak/>
-        <w:rPr>
-          <w:rFonts w:ascii="Courier New" w:hAnsi="Courier New" w:cs="Courier New"/>
-        </w:rPr>
-      </w:r>
-    </w:p>
-    <w:p>
-      <w:pPr>
-        <w:spacing w:after="0"/>
-        <w:rPr>
-          <w:rFonts w:ascii="Courier New" w:hAnsi="Courier New" w:cs="Courier New"/>
-        </w:rPr>
-      </w:pPr>
-      <w:r>
-        <w:lastRenderedPageBreak/>
+    </w:p>
+    <w:p>
+      <w:pPr>
+        <w:spacing w:after="0"/>
+        <w:rPr>
+          <w:rFonts w:ascii="Courier New" w:hAnsi="Courier New" w:cs="Courier New"/>
+        </w:rPr>
+      </w:pPr>
+      <w:r>
+        <w:rPr>
+          <w:noProof/>
+        </w:rPr>
         <w:drawing>
-          <wp:anchor distT="0" distB="0" distL="114300" distR="114300" simplePos="0" relativeHeight="251658240" behindDoc="0" locked="0" layoutInCell="1" allowOverlap="1">
+          <wp:anchor distT="0" distB="0" distL="114300" distR="114300" simplePos="0" relativeHeight="251658240" behindDoc="0" locked="0" layoutInCell="1" allowOverlap="1" wp14:anchorId="0624CEA2" wp14:editId="4D17D7BF">
             <wp:simplePos x="0" y="0"/>
             <wp:positionH relativeFrom="column">
               <wp:posOffset>23495</wp:posOffset>
@@ -4213,7 +3530,7 @@
                     <pic:cNvPicPr/>
                   </pic:nvPicPr>
                   <pic:blipFill>
-                    <a:blip r:embed="rId30"/>
+                    <a:blip r:embed="rId13"/>
                     <a:stretch>
                       <a:fillRect/>
                     </a:stretch>
@@ -4243,10 +3560,7 @@
       </w:pPr>
       <w:r>
         <w:rPr>
-          <w:rFonts w:ascii="Aptos" w:hAnsi="Aptos" w:eastAsia="Aptos" w:cs="Courier New" w:eastAsiaTheme="minorHAnsi"/>
-          <w:kern w:val="2"/>
-          <w:sz w:val="24"/>
-          <w:szCs w:val="24"/>
+          <w:rFonts w:ascii="Aptos" w:hAnsi="Aptos" w:cs="Courier New"/>
         </w:rPr>
         <w:t>A6</w:t>
       </w:r>
@@ -4260,10 +3574,7 @@
       </w:pPr>
       <w:r>
         <w:rPr>
-          <w:rFonts w:ascii="Courier New" w:hAnsi="Courier New" w:eastAsia="Aptos" w:cs="Courier New" w:eastAsiaTheme="minorHAnsi"/>
-          <w:kern w:val="2"/>
-          <w:sz w:val="24"/>
-          <w:szCs w:val="24"/>
+          <w:rFonts w:ascii="Courier New" w:hAnsi="Courier New" w:cs="Courier New"/>
         </w:rPr>
         <w:t>ceph versions \</w:t>
       </w:r>
@@ -4277,10 +3588,7 @@
       </w:pPr>
       <w:r>
         <w:rPr>
-          <w:rFonts w:ascii="Courier New" w:hAnsi="Courier New" w:eastAsia="Aptos" w:cs="Courier New" w:eastAsiaTheme="minorHAnsi"/>
-          <w:kern w:val="2"/>
-          <w:sz w:val="24"/>
-          <w:szCs w:val="24"/>
+          <w:rFonts w:ascii="Courier New" w:hAnsi="Courier New" w:cs="Courier New"/>
         </w:rPr>
         <w:t xml:space="preserve">  &gt; "$EVIDENCE/59-versions-after-X-upgrade.txt"</w:t>
       </w:r>
@@ -4302,10 +3610,7 @@
       </w:pPr>
       <w:r>
         <w:rPr>
-          <w:rFonts w:ascii="Courier New" w:hAnsi="Courier New" w:eastAsia="Aptos" w:cs="Courier New" w:eastAsiaTheme="minorHAnsi"/>
-          <w:kern w:val="2"/>
-          <w:sz w:val="24"/>
-          <w:szCs w:val="24"/>
+          <w:rFonts w:ascii="Courier New" w:hAnsi="Courier New" w:cs="Courier New"/>
         </w:rPr>
         <w:t>ceph -s \</w:t>
       </w:r>
@@ -4319,10 +3624,7 @@
       </w:pPr>
       <w:r>
         <w:rPr>
-          <w:rFonts w:ascii="Courier New" w:hAnsi="Courier New" w:eastAsia="Aptos" w:cs="Courier New" w:eastAsiaTheme="minorHAnsi"/>
-          <w:kern w:val="2"/>
-          <w:sz w:val="24"/>
-          <w:szCs w:val="24"/>
+          <w:rFonts w:ascii="Courier New" w:hAnsi="Courier New" w:cs="Courier New"/>
         </w:rPr>
         <w:t xml:space="preserve">  &gt; "$EVIDENCE/60-after-X-upgrade-ceph-s.txt"</w:t>
       </w:r>
@@ -4344,10 +3646,7 @@
       </w:pPr>
       <w:r>
         <w:rPr>
-          <w:rFonts w:ascii="Courier New" w:hAnsi="Courier New" w:eastAsia="Aptos" w:cs="Courier New" w:eastAsiaTheme="minorHAnsi"/>
-          <w:kern w:val="2"/>
-          <w:sz w:val="24"/>
-          <w:szCs w:val="24"/>
+          <w:rFonts w:ascii="Courier New" w:hAnsi="Courier New" w:cs="Courier New"/>
         </w:rPr>
         <w:t>ceph osd tree \</w:t>
       </w:r>
@@ -4361,10 +3660,7 @@
       </w:pPr>
       <w:r>
         <w:rPr>
-          <w:rFonts w:ascii="Courier New" w:hAnsi="Courier New" w:eastAsia="Aptos" w:cs="Courier New" w:eastAsiaTheme="minorHAnsi"/>
-          <w:kern w:val="2"/>
-          <w:sz w:val="24"/>
-          <w:szCs w:val="24"/>
+          <w:rFonts w:ascii="Courier New" w:hAnsi="Courier New" w:cs="Courier New"/>
         </w:rPr>
         <w:t xml:space="preserve">  &gt; "$EVIDENCE/61-after-X-upgrade-tree.txt"</w:t>
       </w:r>
@@ -4386,10 +3682,7 @@
       </w:pPr>
       <w:r>
         <w:rPr>
-          <w:rFonts w:ascii="Courier New" w:hAnsi="Courier New" w:eastAsia="Aptos" w:cs="Courier New" w:eastAsiaTheme="minorHAnsi"/>
-          <w:kern w:val="2"/>
-          <w:sz w:val="24"/>
-          <w:szCs w:val="24"/>
+          <w:rFonts w:ascii="Courier New" w:hAnsi="Courier New" w:cs="Courier New"/>
         </w:rPr>
         <w:t>ceph pg ls-by-osd $X \</w:t>
       </w:r>
@@ -4403,10 +3696,7 @@
       </w:pPr>
       <w:r>
         <w:rPr>
-          <w:rFonts w:ascii="Courier New" w:hAnsi="Courier New" w:eastAsia="Aptos" w:cs="Courier New" w:eastAsiaTheme="minorHAnsi"/>
-          <w:kern w:val="2"/>
-          <w:sz w:val="24"/>
-          <w:szCs w:val="24"/>
+          <w:rFonts w:ascii="Courier New" w:hAnsi="Courier New" w:cs="Courier New"/>
         </w:rPr>
         <w:t xml:space="preserve">  &gt; "$EVIDENCE/62-X-pgs-after-upgrade.txt"</w:t>
       </w:r>
@@ -4428,10 +3718,7 @@
       </w:pPr>
       <w:r>
         <w:rPr>
-          <w:rFonts w:ascii="Courier New" w:hAnsi="Courier New" w:eastAsia="Aptos" w:cs="Courier New" w:eastAsiaTheme="minorHAnsi"/>
-          <w:kern w:val="2"/>
-          <w:sz w:val="24"/>
-          <w:szCs w:val="24"/>
+          <w:rFonts w:ascii="Courier New" w:hAnsi="Courier New" w:cs="Courier New"/>
         </w:rPr>
         <w:t>ceph health detail \</w:t>
       </w:r>
@@ -4445,10 +3732,7 @@
       </w:pPr>
       <w:r>
         <w:rPr>
-          <w:rFonts w:ascii="Courier New" w:hAnsi="Courier New" w:eastAsia="Aptos" w:cs="Courier New" w:eastAsiaTheme="minorHAnsi"/>
-          <w:kern w:val="2"/>
-          <w:sz w:val="24"/>
-          <w:szCs w:val="24"/>
+          <w:rFonts w:ascii="Courier New" w:hAnsi="Courier New" w:cs="Courier New"/>
         </w:rPr>
         <w:t xml:space="preserve">  &gt; "$EVIDENCE/63-after-X-upgrade-health.txt"</w:t>
       </w:r>
@@ -4470,10 +3754,7 @@
       </w:pPr>
       <w:r>
         <w:rPr>
-          <w:rFonts w:ascii="Courier New" w:hAnsi="Courier New" w:eastAsia="Aptos" w:cs="Courier New" w:eastAsiaTheme="minorHAnsi"/>
-          <w:kern w:val="2"/>
-          <w:sz w:val="24"/>
-          <w:szCs w:val="24"/>
+          <w:rFonts w:ascii="Courier New" w:hAnsi="Courier New" w:cs="Courier New"/>
         </w:rPr>
         <w:t>ceph osd rm-pg-upmap-items $PG</w:t>
       </w:r>
@@ -4495,10 +3776,7 @@
       </w:pPr>
       <w:r>
         <w:rPr>
-          <w:rFonts w:ascii="Aptos" w:hAnsi="Aptos" w:eastAsia="Aptos" w:cs="Courier New" w:eastAsiaTheme="minorHAnsi"/>
-          <w:kern w:val="2"/>
-          <w:sz w:val="24"/>
-          <w:szCs w:val="24"/>
+          <w:rFonts w:ascii="Aptos" w:hAnsi="Aptos" w:cs="Courier New"/>
         </w:rPr>
         <w:t>đây là để trả lại hết pg về</w:t>
       </w:r>
@@ -4512,10 +3790,7 @@
       </w:pPr>
       <w:r>
         <w:rPr>
-          <w:rFonts w:ascii="Courier New" w:hAnsi="Courier New" w:eastAsia="Aptos" w:cs="Courier New" w:eastAsiaTheme="minorHAnsi"/>
-          <w:kern w:val="2"/>
-          <w:sz w:val="24"/>
-          <w:szCs w:val="24"/>
+          <w:rFonts w:ascii="Courier New" w:hAnsi="Courier New" w:cs="Courier New"/>
         </w:rPr>
         <w:t>while IFS= read -r PG; do</w:t>
       </w:r>
@@ -4529,10 +3804,7 @@
       </w:pPr>
       <w:r>
         <w:rPr>
-          <w:rFonts w:ascii="Courier New" w:hAnsi="Courier New" w:eastAsia="Aptos" w:cs="Courier New" w:eastAsiaTheme="minorHAnsi"/>
-          <w:kern w:val="2"/>
-          <w:sz w:val="24"/>
-          <w:szCs w:val="24"/>
+          <w:rFonts w:ascii="Courier New" w:hAnsi="Courier New" w:cs="Courier New"/>
         </w:rPr>
         <w:t xml:space="preserve">    [ -z "$PG" ] &amp;&amp; continue</w:t>
       </w:r>
@@ -4554,10 +3826,7 @@
       </w:pPr>
       <w:r>
         <w:rPr>
-          <w:rFonts w:ascii="Courier New" w:hAnsi="Courier New" w:eastAsia="Aptos" w:cs="Courier New" w:eastAsiaTheme="minorHAnsi"/>
-          <w:kern w:val="2"/>
-          <w:sz w:val="24"/>
-          <w:szCs w:val="24"/>
+          <w:rFonts w:ascii="Courier New" w:hAnsi="Courier New" w:cs="Courier New"/>
         </w:rPr>
         <w:t xml:space="preserve">    echo "RETURN $PG : clear X=$X -&gt; S=$S upmap"</w:t>
       </w:r>
@@ -4579,10 +3848,7 @@
       </w:pPr>
       <w:r>
         <w:rPr>
-          <w:rFonts w:ascii="Courier New" w:hAnsi="Courier New" w:eastAsia="Aptos" w:cs="Courier New" w:eastAsiaTheme="minorHAnsi"/>
-          <w:kern w:val="2"/>
-          <w:sz w:val="24"/>
-          <w:szCs w:val="24"/>
+          <w:rFonts w:ascii="Courier New" w:hAnsi="Courier New" w:cs="Courier New"/>
         </w:rPr>
         <w:t xml:space="preserve">    ceph osd rm-pg-upmap-items "$PG" &lt;/dev/null || true</w:t>
       </w:r>
@@ -4596,10 +3862,7 @@
       </w:pPr>
       <w:r>
         <w:rPr>
-          <w:rFonts w:ascii="Courier New" w:hAnsi="Courier New" w:eastAsia="Aptos" w:cs="Courier New" w:eastAsiaTheme="minorHAnsi"/>
-          <w:kern w:val="2"/>
-          <w:sz w:val="24"/>
-          <w:szCs w:val="24"/>
+          <w:rFonts w:ascii="Courier New" w:hAnsi="Courier New" w:cs="Courier New"/>
         </w:rPr>
         <w:t>done &lt; "$EVIDENCE/41-X-all-pgs-to-drain.txt"</w:t>
       </w:r>
@@ -4611,24 +3874,20 @@
           <w:rFonts w:ascii="Courier New" w:hAnsi="Courier New" w:cs="Courier New"/>
         </w:rPr>
       </w:pPr>
-      <w:r>
-        <w:lastRenderedPageBreak/>
-        <w:rPr>
-          <w:rFonts w:ascii="Courier New" w:hAnsi="Courier New" w:cs="Courier New"/>
-        </w:rPr>
-      </w:r>
-    </w:p>
-    <w:p>
-      <w:pPr>
-        <w:spacing w:after="0"/>
-        <w:rPr>
-          <w:rFonts w:ascii="Courier New" w:hAnsi="Courier New" w:cs="Courier New"/>
-        </w:rPr>
-      </w:pPr>
-      <w:r>
-        <w:lastRenderedPageBreak/>
+    </w:p>
+    <w:p>
+      <w:pPr>
+        <w:spacing w:after="0"/>
+        <w:rPr>
+          <w:rFonts w:ascii="Courier New" w:hAnsi="Courier New" w:cs="Courier New"/>
+        </w:rPr>
+      </w:pPr>
+      <w:r>
+        <w:rPr>
+          <w:noProof/>
+        </w:rPr>
         <w:drawing>
-          <wp:anchor distT="0" distB="0" distL="114300" distR="114300" simplePos="0" relativeHeight="251658240" behindDoc="0" locked="0" layoutInCell="1" allowOverlap="1">
+          <wp:anchor distT="0" distB="0" distL="114300" distR="114300" simplePos="0" relativeHeight="251659264" behindDoc="0" locked="0" layoutInCell="1" allowOverlap="1" wp14:anchorId="26BC8B63" wp14:editId="2A3C1601">
             <wp:simplePos x="0" y="0"/>
             <wp:positionH relativeFrom="column">
               <wp:posOffset>0</wp:posOffset>
@@ -4651,7 +3910,7 @@
                     <pic:cNvPicPr/>
                   </pic:nvPicPr>
                   <pic:blipFill>
-                    <a:blip r:embed="rId31"/>
+                    <a:blip r:embed="rId14"/>
                     <a:stretch>
                       <a:fillRect/>
                     </a:stretch>
@@ -4680,8 +3939,11 @@
         </w:rPr>
       </w:pPr>
       <w:r>
+        <w:rPr>
+          <w:noProof/>
+        </w:rPr>
         <w:drawing>
-          <wp:anchor distT="0" distB="0" distL="114300" distR="114300" simplePos="0" relativeHeight="251658240" behindDoc="0" locked="0" layoutInCell="1" allowOverlap="1">
+          <wp:anchor distT="0" distB="0" distL="114300" distR="114300" simplePos="0" relativeHeight="251660288" behindDoc="0" locked="0" layoutInCell="1" allowOverlap="1" wp14:anchorId="5E24F150" wp14:editId="4A4A78CE">
             <wp:simplePos x="0" y="0"/>
             <wp:positionH relativeFrom="column">
               <wp:posOffset>0</wp:posOffset>
@@ -4704,7 +3966,7 @@
                     <pic:cNvPicPr/>
                   </pic:nvPicPr>
                   <pic:blipFill>
-                    <a:blip r:embed="rId32"/>
+                    <a:blip r:embed="rId15"/>
                     <a:stretch>
                       <a:fillRect/>
                     </a:stretch>
@@ -4738,9 +4000,12 @@
         </w:rPr>
       </w:pPr>
       <w:r>
+        <w:rPr>
+          <w:noProof/>
+        </w:rPr>
         <w:lastRenderedPageBreak/>
         <w:drawing>
-          <wp:anchor distT="0" distB="0" distL="114300" distR="114300" simplePos="0" relativeHeight="251658240" behindDoc="0" locked="0" layoutInCell="1" allowOverlap="1">
+          <wp:anchor distT="0" distB="0" distL="114300" distR="114300" simplePos="0" relativeHeight="251661312" behindDoc="0" locked="0" layoutInCell="1" allowOverlap="1" wp14:anchorId="26096283" wp14:editId="5114EFBD">
             <wp:simplePos x="0" y="0"/>
             <wp:positionH relativeFrom="column">
               <wp:posOffset>0</wp:posOffset>
@@ -4763,7 +4028,7 @@
                     <pic:cNvPicPr/>
                   </pic:nvPicPr>
                   <pic:blipFill>
-                    <a:blip r:embed="rId33"/>
+                    <a:blip r:embed="rId16"/>
                     <a:stretch>
                       <a:fillRect/>
                     </a:stretch>
@@ -4792,8 +4057,11 @@
         </w:rPr>
       </w:pPr>
       <w:r>
+        <w:rPr>
+          <w:noProof/>
+        </w:rPr>
         <w:drawing>
-          <wp:anchor distT="0" distB="0" distL="114300" distR="114300" simplePos="0" relativeHeight="251658240" behindDoc="0" locked="0" layoutInCell="1" allowOverlap="1">
+          <wp:anchor distT="0" distB="0" distL="114300" distR="114300" simplePos="0" relativeHeight="251662336" behindDoc="0" locked="0" layoutInCell="1" allowOverlap="1" wp14:anchorId="2B3E0FAF" wp14:editId="06EC873E">
             <wp:simplePos x="0" y="0"/>
             <wp:positionH relativeFrom="column">
               <wp:posOffset>0</wp:posOffset>
@@ -4816,7 +4084,7 @@
                     <pic:cNvPicPr/>
                   </pic:nvPicPr>
                   <pic:blipFill>
-                    <a:blip r:embed="rId34"/>
+                    <a:blip r:embed="rId17"/>
                     <a:stretch>
                       <a:fillRect/>
                     </a:stretch>
@@ -4846,10 +4114,7 @@
       </w:pPr>
       <w:r>
         <w:rPr>
-          <w:rFonts w:ascii="Courier New" w:hAnsi="Courier New" w:eastAsia="Aptos" w:cs="Courier New" w:eastAsiaTheme="minorHAnsi"/>
-          <w:kern w:val="2"/>
-          <w:sz w:val="24"/>
-          <w:szCs w:val="24"/>
+          <w:rFonts w:ascii="Courier New" w:hAnsi="Courier New" w:cs="Courier New"/>
         </w:rPr>
         <w:t>while :; do</w:t>
       </w:r>
@@ -4863,10 +4128,7 @@
       </w:pPr>
       <w:r>
         <w:rPr>
-          <w:rFonts w:ascii="Courier New" w:hAnsi="Courier New" w:eastAsia="Aptos" w:cs="Courier New" w:eastAsiaTheme="minorHAnsi"/>
-          <w:kern w:val="2"/>
-          <w:sz w:val="24"/>
-          <w:szCs w:val="24"/>
+          <w:rFonts w:ascii="Courier New" w:hAnsi="Courier New" w:cs="Courier New"/>
         </w:rPr>
         <w:t xml:space="preserve">    BAD=$(</w:t>
       </w:r>
@@ -4880,10 +4142,7 @@
       </w:pPr>
       <w:r>
         <w:rPr>
-          <w:rFonts w:ascii="Courier New" w:hAnsi="Courier New" w:eastAsia="Aptos" w:cs="Courier New" w:eastAsiaTheme="minorHAnsi"/>
-          <w:kern w:val="2"/>
-          <w:sz w:val="24"/>
-          <w:szCs w:val="24"/>
+          <w:rFonts w:ascii="Courier New" w:hAnsi="Courier New" w:cs="Courier New"/>
         </w:rPr>
         <w:t xml:space="preserve">        ceph pg dump pgs_brief -f json 2&gt;/dev/null \</w:t>
       </w:r>
@@ -4897,10 +4156,7 @@
       </w:pPr>
       <w:r>
         <w:rPr>
-          <w:rFonts w:ascii="Courier New" w:hAnsi="Courier New" w:eastAsia="Aptos" w:cs="Courier New" w:eastAsiaTheme="minorHAnsi"/>
-          <w:kern w:val="2"/>
-          <w:sz w:val="24"/>
-          <w:szCs w:val="24"/>
+          <w:rFonts w:ascii="Courier New" w:hAnsi="Courier New" w:cs="Courier New"/>
         </w:rPr>
         <w:t xml:space="preserve">        | jq '[.pg_stats[] | select(.state != "active+clean")] | length'</w:t>
       </w:r>
@@ -4914,10 +4170,7 @@
       </w:pPr>
       <w:r>
         <w:rPr>
-          <w:rFonts w:ascii="Courier New" w:hAnsi="Courier New" w:eastAsia="Aptos" w:cs="Courier New" w:eastAsiaTheme="minorHAnsi"/>
-          <w:kern w:val="2"/>
-          <w:sz w:val="24"/>
-          <w:szCs w:val="24"/>
+          <w:rFonts w:ascii="Courier New" w:hAnsi="Courier New" w:cs="Courier New"/>
         </w:rPr>
         <w:t xml:space="preserve">    )</w:t>
       </w:r>
@@ -4939,10 +4192,7 @@
       </w:pPr>
       <w:r>
         <w:rPr>
-          <w:rFonts w:ascii="Courier New" w:hAnsi="Courier New" w:eastAsia="Aptos" w:cs="Courier New" w:eastAsiaTheme="minorHAnsi"/>
-          <w:kern w:val="2"/>
-          <w:sz w:val="24"/>
-          <w:szCs w:val="24"/>
+          <w:rFonts w:ascii="Courier New" w:hAnsi="Courier New" w:cs="Courier New"/>
         </w:rPr>
         <w:t xml:space="preserve">    echo "$(date) PG not active+clean: $BAD"</w:t>
       </w:r>
@@ -4964,10 +4214,7 @@
       </w:pPr>
       <w:r>
         <w:rPr>
-          <w:rFonts w:ascii="Courier New" w:hAnsi="Courier New" w:eastAsia="Aptos" w:cs="Courier New" w:eastAsiaTheme="minorHAnsi"/>
-          <w:kern w:val="2"/>
-          <w:sz w:val="24"/>
-          <w:szCs w:val="24"/>
+          <w:rFonts w:ascii="Courier New" w:hAnsi="Courier New" w:cs="Courier New"/>
         </w:rPr>
         <w:t xml:space="preserve">    if [ "$BAD" -eq 0 ]; then</w:t>
       </w:r>
@@ -4981,10 +4228,7 @@
       </w:pPr>
       <w:r>
         <w:rPr>
-          <w:rFonts w:ascii="Courier New" w:hAnsi="Courier New" w:eastAsia="Aptos" w:cs="Courier New" w:eastAsiaTheme="minorHAnsi"/>
-          <w:kern w:val="2"/>
-          <w:sz w:val="24"/>
-          <w:szCs w:val="24"/>
+          <w:rFonts w:ascii="Courier New" w:hAnsi="Courier New" w:cs="Courier New"/>
         </w:rPr>
         <w:t xml:space="preserve">        echo "ALL PGs converged."</w:t>
       </w:r>
@@ -4998,10 +4242,7 @@
       </w:pPr>
       <w:r>
         <w:rPr>
-          <w:rFonts w:ascii="Courier New" w:hAnsi="Courier New" w:eastAsia="Aptos" w:cs="Courier New" w:eastAsiaTheme="minorHAnsi"/>
-          <w:kern w:val="2"/>
-          <w:sz w:val="24"/>
-          <w:szCs w:val="24"/>
+          <w:rFonts w:ascii="Courier New" w:hAnsi="Courier New" w:cs="Courier New"/>
         </w:rPr>
         <w:t xml:space="preserve">        break</w:t>
       </w:r>
@@ -5015,10 +4256,7 @@
       </w:pPr>
       <w:r>
         <w:rPr>
-          <w:rFonts w:ascii="Courier New" w:hAnsi="Courier New" w:eastAsia="Aptos" w:cs="Courier New" w:eastAsiaTheme="minorHAnsi"/>
-          <w:kern w:val="2"/>
-          <w:sz w:val="24"/>
-          <w:szCs w:val="24"/>
+          <w:rFonts w:ascii="Courier New" w:hAnsi="Courier New" w:cs="Courier New"/>
         </w:rPr>
         <w:t xml:space="preserve">    fi</w:t>
       </w:r>
@@ -5040,10 +4278,7 @@
       </w:pPr>
       <w:r>
         <w:rPr>
-          <w:rFonts w:ascii="Courier New" w:hAnsi="Courier New" w:eastAsia="Aptos" w:cs="Courier New" w:eastAsiaTheme="minorHAnsi"/>
-          <w:kern w:val="2"/>
-          <w:sz w:val="24"/>
-          <w:szCs w:val="24"/>
+          <w:rFonts w:ascii="Courier New" w:hAnsi="Courier New" w:cs="Courier New"/>
         </w:rPr>
         <w:t xml:space="preserve">    sleep 5</w:t>
       </w:r>
@@ -5057,10 +4292,7 @@
       </w:pPr>
       <w:r>
         <w:rPr>
-          <w:rFonts w:ascii="Courier New" w:hAnsi="Courier New" w:eastAsia="Aptos" w:cs="Courier New" w:eastAsiaTheme="minorHAnsi"/>
-          <w:kern w:val="2"/>
-          <w:sz w:val="24"/>
-          <w:szCs w:val="24"/>
+          <w:rFonts w:ascii="Courier New" w:hAnsi="Courier New" w:cs="Courier New"/>
         </w:rPr>
         <w:t>done</w:t>
       </w:r>
@@ -5074,10 +4306,7 @@
       </w:pPr>
       <w:r>
         <w:rPr>
-          <w:rFonts w:ascii="Courier New" w:hAnsi="Courier New" w:eastAsia="Aptos" w:cs="Courier New" w:eastAsiaTheme="minorHAnsi"/>
-          <w:kern w:val="2"/>
-          <w:sz w:val="24"/>
-          <w:szCs w:val="24"/>
+          <w:rFonts w:ascii="Courier New" w:hAnsi="Courier New" w:cs="Courier New"/>
         </w:rPr>
         <w:t>check</w:t>
       </w:r>
@@ -5089,8 +4318,11 @@
         </w:rPr>
       </w:pPr>
       <w:r>
+        <w:rPr>
+          <w:noProof/>
+        </w:rPr>
         <w:drawing>
-          <wp:anchor distT="0" distB="0" distL="114300" distR="114300" simplePos="0" relativeHeight="251658240" behindDoc="0" locked="0" layoutInCell="1" allowOverlap="1">
+          <wp:anchor distT="0" distB="0" distL="114300" distR="114300" simplePos="0" relativeHeight="251663360" behindDoc="0" locked="0" layoutInCell="1" allowOverlap="1" wp14:anchorId="3B0D00C2" wp14:editId="7CE2E4E5">
             <wp:simplePos x="0" y="0"/>
             <wp:positionH relativeFrom="column">
               <wp:posOffset>0</wp:posOffset>
@@ -5113,7 +4345,7 @@
                     <pic:cNvPicPr/>
                   </pic:nvPicPr>
                   <pic:blipFill>
-                    <a:blip r:embed="rId35"/>
+                    <a:blip r:embed="rId18"/>
                     <a:stretch>
                       <a:fillRect/>
                     </a:stretch>
@@ -5148,14 +4380,11 @@
         </w:rPr>
       </w:pPr>
       <w:r>
+        <w:rPr>
+          <w:rFonts w:ascii="Aptos" w:hAnsi="Aptos" w:cs="Courier New"/>
+          <w:u w:val="double"/>
+        </w:rPr>
         <w:lastRenderedPageBreak/>
-        <w:rPr>
-          <w:rFonts w:ascii="Aptos" w:hAnsi="Aptos" w:eastAsia="Aptos" w:cs="Courier New" w:eastAsiaTheme="minorHAnsi"/>
-          <w:kern w:val="2"/>
-          <w:sz w:val="24"/>
-          <w:szCs w:val="24"/>
-          <w:u w:val="double"/>
-        </w:rPr>
         <w:t xml:space="preserve">kiểm tra xem là cái upmap còn không </w:t>
       </w:r>
     </w:p>
@@ -5168,10 +4397,7 @@
       </w:pPr>
       <w:r>
         <w:rPr>
-          <w:rFonts w:ascii="Courier New" w:hAnsi="Courier New" w:eastAsia="Aptos" w:cs="Courier New" w:eastAsiaTheme="minorHAnsi"/>
-          <w:kern w:val="2"/>
-          <w:sz w:val="24"/>
-          <w:szCs w:val="24"/>
+          <w:rFonts w:ascii="Courier New" w:hAnsi="Courier New" w:cs="Courier New"/>
         </w:rPr>
         <w:t>ceph osd dump -f json \</w:t>
       </w:r>
@@ -5185,10 +4411,7 @@
       </w:pPr>
       <w:r>
         <w:rPr>
-          <w:rFonts w:ascii="Courier New" w:hAnsi="Courier New" w:eastAsia="Aptos" w:cs="Courier New" w:eastAsiaTheme="minorHAnsi"/>
-          <w:kern w:val="2"/>
-          <w:sz w:val="24"/>
-          <w:szCs w:val="24"/>
+          <w:rFonts w:ascii="Courier New" w:hAnsi="Courier New" w:cs="Courier New"/>
         </w:rPr>
         <w:t xml:space="preserve">  | jq '.pg_upmap_items'</w:t>
       </w:r>
@@ -5210,10 +4433,7 @@
       </w:pPr>
       <w:r>
         <w:rPr>
-          <w:rFonts w:ascii="Aptos" w:hAnsi="Aptos" w:eastAsia="Aptos" w:cs="Courier New" w:eastAsiaTheme="minorHAnsi"/>
-          <w:kern w:val="2"/>
-          <w:sz w:val="24"/>
-          <w:szCs w:val="24"/>
+          <w:rFonts w:ascii="Aptos" w:hAnsi="Aptos" w:cs="Courier New"/>
         </w:rPr>
         <w:t>Rétore afinity</w:t>
       </w:r>
@@ -5227,10 +4447,7 @@
       </w:pPr>
       <w:r>
         <w:rPr>
-          <w:rFonts w:ascii="Courier New" w:hAnsi="Courier New" w:eastAsia="Aptos" w:cs="Courier New" w:eastAsiaTheme="minorHAnsi"/>
-          <w:kern w:val="2"/>
-          <w:sz w:val="24"/>
-          <w:szCs w:val="24"/>
+          <w:rFonts w:ascii="Courier New" w:hAnsi="Courier New" w:cs="Courier New"/>
         </w:rPr>
         <w:t>ceph osd primary-affinity osd.$X 1</w:t>
       </w:r>
@@ -5252,10 +4469,7 @@
       </w:pPr>
       <w:r>
         <w:rPr>
-          <w:rFonts w:ascii="Aptos" w:hAnsi="Aptos" w:eastAsia="Aptos" w:cs="Courier New" w:eastAsiaTheme="minorHAnsi"/>
-          <w:kern w:val="2"/>
-          <w:sz w:val="24"/>
-          <w:szCs w:val="24"/>
+          <w:rFonts w:ascii="Aptos" w:hAnsi="Aptos" w:cs="Courier New"/>
         </w:rPr>
         <w:t>reweight lại về 0 cái S</w:t>
       </w:r>
@@ -5269,10 +4483,7 @@
       </w:pPr>
       <w:r>
         <w:rPr>
-          <w:rFonts w:ascii="Courier New" w:hAnsi="Courier New" w:eastAsia="Aptos" w:cs="Courier New" w:eastAsiaTheme="minorHAnsi"/>
-          <w:kern w:val="2"/>
-          <w:sz w:val="24"/>
-          <w:szCs w:val="24"/>
+          <w:rFonts w:ascii="Courier New" w:hAnsi="Courier New" w:cs="Courier New"/>
         </w:rPr>
         <w:t>ceph osd crush reweight osd.$S 0</w:t>
       </w:r>
@@ -5294,10 +4505,7 @@
       </w:pPr>
       <w:r>
         <w:rPr>
-          <w:rFonts w:ascii="Aptos" w:hAnsi="Aptos" w:eastAsia="Aptos" w:cs="Courier New" w:eastAsiaTheme="minorHAnsi"/>
-          <w:kern w:val="2"/>
-          <w:sz w:val="24"/>
-          <w:szCs w:val="24"/>
+          <w:rFonts w:ascii="Aptos" w:hAnsi="Aptos" w:cs="Courier New"/>
         </w:rPr>
         <w:t xml:space="preserve">kiểm tra xem osd S back up còn PG được crush map mới đẩy vào không </w:t>
       </w:r>
@@ -5311,10 +4519,7 @@
       </w:pPr>
       <w:r>
         <w:rPr>
-          <w:rFonts w:ascii="Courier New" w:hAnsi="Courier New" w:eastAsia="Aptos" w:cs="Courier New" w:eastAsiaTheme="minorHAnsi"/>
-          <w:kern w:val="2"/>
-          <w:sz w:val="24"/>
-          <w:szCs w:val="24"/>
+          <w:rFonts w:ascii="Courier New" w:hAnsi="Courier New" w:cs="Courier New"/>
         </w:rPr>
         <w:t>ceph pg ls-by-osd $S</w:t>
       </w:r>
@@ -5336,36 +4541,21 @@
       </w:pPr>
       <w:r>
         <w:rPr>
-          <w:rFonts w:ascii="Aptos" w:hAnsi="Aptos" w:eastAsia="Aptos" w:cs="Courier New" w:eastAsiaTheme="minorHAnsi"/>
-          <w:kern w:val="2"/>
-          <w:sz w:val="24"/>
-          <w:szCs w:val="24"/>
-        </w:rPr>
-        <w:t xml:space="preserve">set </w:t>
-      </w:r>
-      <w:r>
-        <w:rPr>
-          <w:rFonts w:ascii="Aptos" w:hAnsi="Aptos" w:eastAsia="Aptos" w:cs="Courier New" w:eastAsiaTheme="minorHAnsi"/>
-          <w:kern w:val="2"/>
-          <w:sz w:val="24"/>
-          <w:szCs w:val="24"/>
-        </w:rPr>
-        <w:t>bỏ noout</w:t>
-      </w:r>
-    </w:p>
-    <w:p>
-      <w:pPr>
-        <w:spacing w:after="0"/>
-        <w:rPr>
-          <w:rFonts w:ascii="Courier New" w:hAnsi="Courier New" w:cs="Courier New"/>
-        </w:rPr>
-      </w:pPr>
-      <w:r>
-        <w:rPr>
-          <w:rFonts w:ascii="Courier New" w:hAnsi="Courier New" w:eastAsia="Aptos" w:cs="Courier New" w:eastAsiaTheme="minorHAnsi"/>
-          <w:kern w:val="2"/>
-          <w:sz w:val="24"/>
-          <w:szCs w:val="24"/>
+          <w:rFonts w:ascii="Aptos" w:hAnsi="Aptos" w:cs="Courier New"/>
+        </w:rPr>
+        <w:t>set bỏ noout</w:t>
+      </w:r>
+    </w:p>
+    <w:p>
+      <w:pPr>
+        <w:spacing w:after="0"/>
+        <w:rPr>
+          <w:rFonts w:ascii="Courier New" w:hAnsi="Courier New" w:cs="Courier New"/>
+        </w:rPr>
+      </w:pPr>
+      <w:r>
+        <w:rPr>
+          <w:rFonts w:ascii="Courier New" w:hAnsi="Courier New" w:cs="Courier New"/>
         </w:rPr>
         <w:t>ceph osd unset-group noout osd.$X</w:t>
       </w:r>
@@ -5382,22 +4572,22 @@
       <w:pPr>
         <w:spacing w:after="0"/>
         <w:rPr>
-          <w:rFonts w:ascii="Courier New" w:hAnsi="Courier New" w:cs="Courier New"/>
-        </w:rPr>
-      </w:pPr>
-      <w:r>
+          <w:rFonts w:ascii="Aptos" w:hAnsi="Aptos" w:cs="Courier New"/>
+        </w:rPr>
+      </w:pPr>
+      <w:r>
+        <w:rPr>
+          <w:rFonts w:ascii="Aptos" w:hAnsi="Aptos" w:cs="Courier New"/>
+        </w:rPr>
         <w:lastRenderedPageBreak/>
-        <w:rPr>
-          <w:rFonts w:ascii="Aptos" w:hAnsi="Aptos" w:eastAsia="Aptos" w:cs="Courier New" w:eastAsiaTheme="minorHAnsi"/>
-          <w:kern w:val="2"/>
-          <w:sz w:val="24"/>
-          <w:szCs w:val="24"/>
-        </w:rPr>
         <w:t>đã</w:t>
       </w:r>
       <w:r>
+        <w:rPr>
+          <w:noProof/>
+        </w:rPr>
         <w:drawing>
-          <wp:anchor distT="0" distB="0" distL="114300" distR="114300" simplePos="0" relativeHeight="251658240" behindDoc="0" locked="0" layoutInCell="1" allowOverlap="1">
+          <wp:anchor distT="0" distB="0" distL="114300" distR="114300" simplePos="0" relativeHeight="251664384" behindDoc="0" locked="0" layoutInCell="1" allowOverlap="1" wp14:anchorId="27741DE7" wp14:editId="2CABF25F">
             <wp:simplePos x="0" y="0"/>
             <wp:positionH relativeFrom="column">
               <wp:posOffset>0</wp:posOffset>
@@ -5420,7 +4610,7 @@
                     <pic:cNvPicPr/>
                   </pic:nvPicPr>
                   <pic:blipFill>
-                    <a:blip r:embed="rId36"/>
+                    <a:blip r:embed="rId19"/>
                     <a:stretch>
                       <a:fillRect/>
                     </a:stretch>
@@ -5442,17 +4632,97 @@
       </w:r>
       <w:r>
         <w:rPr>
-          <w:rFonts w:ascii="Aptos" w:hAnsi="Aptos" w:eastAsia="Aptos" w:cs="Courier New" w:eastAsiaTheme="minorHAnsi"/>
-          <w:kern w:val="2"/>
-          <w:sz w:val="24"/>
-          <w:szCs w:val="24"/>
+          <w:rFonts w:ascii="Aptos" w:hAnsi="Aptos" w:cs="Courier New"/>
         </w:rPr>
         <w:t xml:space="preserve"> checksum lại so với bản gốc bản này là bản sau khi osd X được làm primary</w:t>
       </w:r>
+    </w:p>
+    <w:p>
+      <w:pPr>
+        <w:spacing w:after="0"/>
+        <w:rPr>
+          <w:rFonts w:ascii="Aptos" w:hAnsi="Aptos" w:cs="Courier New"/>
+        </w:rPr>
+      </w:pPr>
+    </w:p>
+    <w:p>
+      <w:pPr>
+        <w:spacing w:after="0"/>
+        <w:rPr>
+          <w:rFonts w:ascii="Aptos" w:hAnsi="Aptos" w:cs="Courier New"/>
+        </w:rPr>
+      </w:pPr>
+    </w:p>
+    <w:p>
+      <w:pPr>
+        <w:spacing w:after="0"/>
+        <w:rPr>
+          <w:rFonts w:ascii="Aptos" w:hAnsi="Aptos" w:cs="Courier New"/>
+        </w:rPr>
+      </w:pPr>
+      <w:r>
+        <w:rPr>
+          <w:rFonts w:ascii="Aptos" w:hAnsi="Aptos" w:cs="Courier New"/>
+          <w:lang w:val="vi-VN"/>
+        </w:rPr>
+        <w:t>chứng minh không bị ảnh hưởng osd x mồ côi , drained dữ liệu và upmap</w:t>
+      </w:r>
+      <w:r>
+        <w:rPr>
+          <w:rFonts w:ascii="Aptos" w:hAnsi="Aptos" w:cs="Courier New"/>
+        </w:rPr>
+        <w:t xml:space="preserve">, </w:t>
+      </w:r>
+    </w:p>
+    <w:p>
+      <w:pPr>
+        <w:spacing w:after="0"/>
+        <w:rPr>
+          <w:rFonts w:ascii="Courier New" w:hAnsi="Courier New" w:cs="Courier New"/>
+        </w:rPr>
+      </w:pPr>
+      <w:r>
+        <w:rPr>
+          <w:rFonts w:ascii="Courier New" w:hAnsi="Courier New" w:cs="Courier New"/>
+          <w:lang w:val="vi-VN"/>
+        </w:rPr>
+        <w:t xml:space="preserve">deep scrub truowsc upgrade, </w:t>
+      </w:r>
+      <w:r>
+        <w:rPr>
+          <w:rFonts w:ascii="Courier New" w:hAnsi="Courier New" w:cs="Courier New"/>
+        </w:rPr>
+        <w:t>chuwnsg minh check sum H0 taijsao no can kem error</w:t>
+      </w:r>
+    </w:p>
+    <w:p>
+      <w:pPr>
+        <w:spacing w:after="0"/>
+        <w:rPr>
+          <w:rFonts w:ascii="Courier New" w:hAnsi="Courier New" w:cs="Courier New"/>
+        </w:rPr>
+      </w:pPr>
+    </w:p>
+    <w:p>
+      <w:pPr>
+        <w:spacing w:after="0"/>
+        <w:rPr>
+          <w:rFonts w:ascii="Courier New" w:hAnsi="Courier New" w:cs="Courier New"/>
+        </w:rPr>
+      </w:pPr>
+    </w:p>
+    <w:p>
+      <w:pPr>
+        <w:spacing w:after="0"/>
+        <w:rPr>
+          <w:rFonts w:ascii="Courier New" w:hAnsi="Courier New" w:cs="Courier New"/>
+        </w:rPr>
+      </w:pPr>
     </w:p>
     <w:sectPr>
       <w:pgSz w:w="12240" w:h="15840"/>
       <w:pgMar w:top="1440" w:right="1440" w:bottom="1440" w:left="1440" w:header="720" w:footer="720" w:gutter="0"/>
+      <w:cols w:space="720"/>
       <w:docGrid w:linePitch="360"/>
     </w:sectPr>
   </w:body>

</xml_diff>